<commit_message>
Ajout explications badges dans INI_slides et Support, et nouveau Badge 'Pied à l'étrier'
</commit_message>
<xml_diff>
--- a/_support/Introduction_et_annexes.docx
+++ b/_support/Introduction_et_annexes.docx
@@ -97,7 +97,7 @@
     <w:sdt>
       <w:sdtPr>
         <w:alias w:val="Table des matières"/>
-        <w:id w:val="-210038131"/>
+        <w:id w:val="-231548290"/>
       </w:sdtPr>
       <w:sdtContent>
         <w:p>
@@ -124,7 +124,7 @@
           <w:r>
             <w:fldChar w:fldCharType="separate"/>
           </w:r>
-          <w:hyperlink w:anchor="_Toc243655215" w:history="1">
+          <w:hyperlink w:anchor="_Toc243730333" w:history="1">
             <w:r>
               <w:rPr>
                 <w:rStyle w:val="Lienhypertexte"/>
@@ -150,7 +150,7 @@
               <w:rPr>
                 <w:noProof/>
               </w:rPr>
-              <w:instrText xml:space="preserve"> PAGEREF _Toc243655215 \h </w:instrText>
+              <w:instrText xml:space="preserve"> PAGEREF _Toc243730333 \h </w:instrText>
             </w:r>
             <w:r>
               <w:rPr>
@@ -192,7 +192,7 @@
               <w14:ligatures w14:val="standardContextual"/>
             </w:rPr>
           </w:pPr>
-          <w:hyperlink w:anchor="_Toc243655216" w:history="1">
+          <w:hyperlink w:anchor="_Toc243730334" w:history="1">
             <w:r>
               <w:rPr>
                 <w:rStyle w:val="Lienhypertexte"/>
@@ -218,7 +218,7 @@
               <w:rPr>
                 <w:noProof/>
               </w:rPr>
-              <w:instrText xml:space="preserve"> PAGEREF _Toc243655216 \h </w:instrText>
+              <w:instrText xml:space="preserve"> PAGEREF _Toc243730334 \h </w:instrText>
             </w:r>
             <w:r>
               <w:rPr>
@@ -260,7 +260,7 @@
               <w14:ligatures w14:val="standardContextual"/>
             </w:rPr>
           </w:pPr>
-          <w:hyperlink w:anchor="_Toc243655217" w:history="1">
+          <w:hyperlink w:anchor="_Toc243730335" w:history="1">
             <w:r>
               <w:rPr>
                 <w:rStyle w:val="Lienhypertexte"/>
@@ -286,7 +286,7 @@
               <w:rPr>
                 <w:noProof/>
               </w:rPr>
-              <w:instrText xml:space="preserve"> PAGEREF _Toc243655217 \h </w:instrText>
+              <w:instrText xml:space="preserve"> PAGEREF _Toc243730335 \h </w:instrText>
             </w:r>
             <w:r>
               <w:rPr>
@@ -328,7 +328,7 @@
               <w14:ligatures w14:val="standardContextual"/>
             </w:rPr>
           </w:pPr>
-          <w:hyperlink w:anchor="_Toc243655218" w:history="1">
+          <w:hyperlink w:anchor="_Toc243730336" w:history="1">
             <w:r>
               <w:rPr>
                 <w:rStyle w:val="Lienhypertexte"/>
@@ -354,7 +354,7 @@
               <w:rPr>
                 <w:noProof/>
               </w:rPr>
-              <w:instrText xml:space="preserve"> PAGEREF _Toc243655218 \h </w:instrText>
+              <w:instrText xml:space="preserve"> PAGEREF _Toc243730336 \h </w:instrText>
             </w:r>
             <w:r>
               <w:rPr>
@@ -396,7 +396,7 @@
               <w14:ligatures w14:val="standardContextual"/>
             </w:rPr>
           </w:pPr>
-          <w:hyperlink w:anchor="_Toc243655219" w:history="1">
+          <w:hyperlink w:anchor="_Toc243730337" w:history="1">
             <w:r>
               <w:rPr>
                 <w:rStyle w:val="Lienhypertexte"/>
@@ -422,7 +422,7 @@
               <w:rPr>
                 <w:noProof/>
               </w:rPr>
-              <w:instrText xml:space="preserve"> PAGEREF _Toc243655219 \h </w:instrText>
+              <w:instrText xml:space="preserve"> PAGEREF _Toc243730337 \h </w:instrText>
             </w:r>
             <w:r>
               <w:rPr>
@@ -464,7 +464,7 @@
               <w14:ligatures w14:val="standardContextual"/>
             </w:rPr>
           </w:pPr>
-          <w:hyperlink w:anchor="_Toc243655220" w:history="1">
+          <w:hyperlink w:anchor="_Toc243730338" w:history="1">
             <w:r>
               <w:rPr>
                 <w:rStyle w:val="Lienhypertexte"/>
@@ -490,7 +490,7 @@
               <w:rPr>
                 <w:noProof/>
               </w:rPr>
-              <w:instrText xml:space="preserve"> PAGEREF _Toc243655220 \h </w:instrText>
+              <w:instrText xml:space="preserve"> PAGEREF _Toc243730338 \h </w:instrText>
             </w:r>
             <w:r>
               <w:rPr>
@@ -532,7 +532,7 @@
               <w14:ligatures w14:val="standardContextual"/>
             </w:rPr>
           </w:pPr>
-          <w:hyperlink w:anchor="_Toc243655221" w:history="1">
+          <w:hyperlink w:anchor="_Toc243730339" w:history="1">
             <w:r>
               <w:rPr>
                 <w:rStyle w:val="Lienhypertexte"/>
@@ -558,7 +558,7 @@
               <w:rPr>
                 <w:noProof/>
               </w:rPr>
-              <w:instrText xml:space="preserve"> PAGEREF _Toc243655221 \h </w:instrText>
+              <w:instrText xml:space="preserve"> PAGEREF _Toc243730339 \h </w:instrText>
             </w:r>
             <w:r>
               <w:rPr>
@@ -600,7 +600,7 @@
               <w14:ligatures w14:val="standardContextual"/>
             </w:rPr>
           </w:pPr>
-          <w:hyperlink w:anchor="_Toc243655222" w:history="1">
+          <w:hyperlink w:anchor="_Toc243730340" w:history="1">
             <w:r>
               <w:rPr>
                 <w:rStyle w:val="Lienhypertexte"/>
@@ -626,7 +626,7 @@
               <w:rPr>
                 <w:noProof/>
               </w:rPr>
-              <w:instrText xml:space="preserve"> PAGEREF _Toc243655222 \h </w:instrText>
+              <w:instrText xml:space="preserve"> PAGEREF _Toc243730340 \h </w:instrText>
             </w:r>
             <w:r>
               <w:rPr>
@@ -668,7 +668,7 @@
               <w14:ligatures w14:val="standardContextual"/>
             </w:rPr>
           </w:pPr>
-          <w:hyperlink w:anchor="_Toc243655223" w:history="1">
+          <w:hyperlink w:anchor="_Toc243730341" w:history="1">
             <w:r>
               <w:rPr>
                 <w:rStyle w:val="Lienhypertexte"/>
@@ -694,7 +694,7 @@
               <w:rPr>
                 <w:noProof/>
               </w:rPr>
-              <w:instrText xml:space="preserve"> PAGEREF _Toc243655223 \h </w:instrText>
+              <w:instrText xml:space="preserve"> PAGEREF _Toc243730341 \h </w:instrText>
             </w:r>
             <w:r>
               <w:rPr>
@@ -736,7 +736,7 @@
               <w14:ligatures w14:val="standardContextual"/>
             </w:rPr>
           </w:pPr>
-          <w:hyperlink w:anchor="_Toc243655224" w:history="1">
+          <w:hyperlink w:anchor="_Toc243730342" w:history="1">
             <w:r>
               <w:rPr>
                 <w:rStyle w:val="Lienhypertexte"/>
@@ -762,7 +762,7 @@
               <w:rPr>
                 <w:noProof/>
               </w:rPr>
-              <w:instrText xml:space="preserve"> PAGEREF _Toc243655224 \h </w:instrText>
+              <w:instrText xml:space="preserve"> PAGEREF _Toc243730342 \h </w:instrText>
             </w:r>
             <w:r>
               <w:rPr>
@@ -804,7 +804,7 @@
               <w14:ligatures w14:val="standardContextual"/>
             </w:rPr>
           </w:pPr>
-          <w:hyperlink w:anchor="_Toc243655225" w:history="1">
+          <w:hyperlink w:anchor="_Toc243730343" w:history="1">
             <w:r>
               <w:rPr>
                 <w:rStyle w:val="Lienhypertexte"/>
@@ -830,7 +830,7 @@
               <w:rPr>
                 <w:noProof/>
               </w:rPr>
-              <w:instrText xml:space="preserve"> PAGEREF _Toc243655225 \h </w:instrText>
+              <w:instrText xml:space="preserve"> PAGEREF _Toc243730343 \h </w:instrText>
             </w:r>
             <w:r>
               <w:rPr>
@@ -872,7 +872,7 @@
               <w14:ligatures w14:val="standardContextual"/>
             </w:rPr>
           </w:pPr>
-          <w:hyperlink w:anchor="_Toc243655226" w:history="1">
+          <w:hyperlink w:anchor="_Toc243730344" w:history="1">
             <w:r>
               <w:rPr>
                 <w:rStyle w:val="Lienhypertexte"/>
@@ -898,7 +898,7 @@
               <w:rPr>
                 <w:noProof/>
               </w:rPr>
-              <w:instrText xml:space="preserve"> PAGEREF _Toc243655226 \h </w:instrText>
+              <w:instrText xml:space="preserve"> PAGEREF _Toc243730344 \h </w:instrText>
             </w:r>
             <w:r>
               <w:rPr>
@@ -940,7 +940,7 @@
               <w14:ligatures w14:val="standardContextual"/>
             </w:rPr>
           </w:pPr>
-          <w:hyperlink w:anchor="_Toc243655227" w:history="1">
+          <w:hyperlink w:anchor="_Toc243730345" w:history="1">
             <w:r>
               <w:rPr>
                 <w:rStyle w:val="Lienhypertexte"/>
@@ -966,7 +966,7 @@
               <w:rPr>
                 <w:noProof/>
               </w:rPr>
-              <w:instrText xml:space="preserve"> PAGEREF _Toc243655227 \h </w:instrText>
+              <w:instrText xml:space="preserve"> PAGEREF _Toc243730345 \h </w:instrText>
             </w:r>
             <w:r>
               <w:rPr>
@@ -1008,7 +1008,7 @@
               <w14:ligatures w14:val="standardContextual"/>
             </w:rPr>
           </w:pPr>
-          <w:hyperlink w:anchor="_Toc243655228" w:history="1">
+          <w:hyperlink w:anchor="_Toc243730346" w:history="1">
             <w:r>
               <w:rPr>
                 <w:rStyle w:val="Lienhypertexte"/>
@@ -1034,7 +1034,7 @@
               <w:rPr>
                 <w:noProof/>
               </w:rPr>
-              <w:instrText xml:space="preserve"> PAGEREF _Toc243655228 \h </w:instrText>
+              <w:instrText xml:space="preserve"> PAGEREF _Toc243730346 \h </w:instrText>
             </w:r>
             <w:r>
               <w:rPr>
@@ -1076,7 +1076,7 @@
               <w14:ligatures w14:val="standardContextual"/>
             </w:rPr>
           </w:pPr>
-          <w:hyperlink w:anchor="_Toc243655229" w:history="1">
+          <w:hyperlink w:anchor="_Toc243730347" w:history="1">
             <w:r>
               <w:rPr>
                 <w:rStyle w:val="Lienhypertexte"/>
@@ -1102,7 +1102,7 @@
               <w:rPr>
                 <w:noProof/>
               </w:rPr>
-              <w:instrText xml:space="preserve"> PAGEREF _Toc243655229 \h </w:instrText>
+              <w:instrText xml:space="preserve"> PAGEREF _Toc243730347 \h </w:instrText>
             </w:r>
             <w:r>
               <w:rPr>
@@ -1144,7 +1144,7 @@
               <w14:ligatures w14:val="standardContextual"/>
             </w:rPr>
           </w:pPr>
-          <w:hyperlink w:anchor="_Toc243655230" w:history="1">
+          <w:hyperlink w:anchor="_Toc243730348" w:history="1">
             <w:r>
               <w:rPr>
                 <w:rStyle w:val="Lienhypertexte"/>
@@ -1170,7 +1170,7 @@
               <w:rPr>
                 <w:noProof/>
               </w:rPr>
-              <w:instrText xml:space="preserve"> PAGEREF _Toc243655230 \h </w:instrText>
+              <w:instrText xml:space="preserve"> PAGEREF _Toc243730348 \h </w:instrText>
             </w:r>
             <w:r>
               <w:rPr>
@@ -1212,7 +1212,7 @@
               <w14:ligatures w14:val="standardContextual"/>
             </w:rPr>
           </w:pPr>
-          <w:hyperlink w:anchor="_Toc243655231" w:history="1">
+          <w:hyperlink w:anchor="_Toc243730349" w:history="1">
             <w:r>
               <w:rPr>
                 <w:rStyle w:val="Lienhypertexte"/>
@@ -1238,7 +1238,7 @@
               <w:rPr>
                 <w:noProof/>
               </w:rPr>
-              <w:instrText xml:space="preserve"> PAGEREF _Toc243655231 \h </w:instrText>
+              <w:instrText xml:space="preserve"> PAGEREF _Toc243730349 \h </w:instrText>
             </w:r>
             <w:r>
               <w:rPr>
@@ -1280,7 +1280,7 @@
               <w14:ligatures w14:val="standardContextual"/>
             </w:rPr>
           </w:pPr>
-          <w:hyperlink w:anchor="_Toc243655232" w:history="1">
+          <w:hyperlink w:anchor="_Toc243730350" w:history="1">
             <w:r>
               <w:rPr>
                 <w:rStyle w:val="Lienhypertexte"/>
@@ -1306,7 +1306,7 @@
               <w:rPr>
                 <w:noProof/>
               </w:rPr>
-              <w:instrText xml:space="preserve"> PAGEREF _Toc243655232 \h </w:instrText>
+              <w:instrText xml:space="preserve"> PAGEREF _Toc243730350 \h </w:instrText>
             </w:r>
             <w:r>
               <w:rPr>
@@ -1348,7 +1348,7 @@
               <w14:ligatures w14:val="standardContextual"/>
             </w:rPr>
           </w:pPr>
-          <w:hyperlink w:anchor="_Toc243655233" w:history="1">
+          <w:hyperlink w:anchor="_Toc243730351" w:history="1">
             <w:r>
               <w:rPr>
                 <w:rStyle w:val="Lienhypertexte"/>
@@ -1374,7 +1374,7 @@
               <w:rPr>
                 <w:noProof/>
               </w:rPr>
-              <w:instrText xml:space="preserve"> PAGEREF _Toc243655233 \h </w:instrText>
+              <w:instrText xml:space="preserve"> PAGEREF _Toc243730351 \h </w:instrText>
             </w:r>
             <w:r>
               <w:rPr>
@@ -1416,7 +1416,7 @@
               <w14:ligatures w14:val="standardContextual"/>
             </w:rPr>
           </w:pPr>
-          <w:hyperlink w:anchor="_Toc243655234" w:history="1">
+          <w:hyperlink w:anchor="_Toc243730352" w:history="1">
             <w:r>
               <w:rPr>
                 <w:rStyle w:val="Lienhypertexte"/>
@@ -1442,7 +1442,7 @@
               <w:rPr>
                 <w:noProof/>
               </w:rPr>
-              <w:instrText xml:space="preserve"> PAGEREF _Toc243655234 \h </w:instrText>
+              <w:instrText xml:space="preserve"> PAGEREF _Toc243730352 \h </w:instrText>
             </w:r>
             <w:r>
               <w:rPr>
@@ -1484,7 +1484,7 @@
               <w14:ligatures w14:val="standardContextual"/>
             </w:rPr>
           </w:pPr>
-          <w:hyperlink w:anchor="_Toc243655235" w:history="1">
+          <w:hyperlink w:anchor="_Toc243730353" w:history="1">
             <w:r>
               <w:rPr>
                 <w:rStyle w:val="Lienhypertexte"/>
@@ -1510,7 +1510,7 @@
               <w:rPr>
                 <w:noProof/>
               </w:rPr>
-              <w:instrText xml:space="preserve"> PAGEREF _Toc243655235 \h </w:instrText>
+              <w:instrText xml:space="preserve"> PAGEREF _Toc243730353 \h </w:instrText>
             </w:r>
             <w:r>
               <w:rPr>
@@ -1552,7 +1552,7 @@
               <w14:ligatures w14:val="standardContextual"/>
             </w:rPr>
           </w:pPr>
-          <w:hyperlink w:anchor="_Toc243655236" w:history="1">
+          <w:hyperlink w:anchor="_Toc243730354" w:history="1">
             <w:r>
               <w:rPr>
                 <w:rStyle w:val="Lienhypertexte"/>
@@ -1578,7 +1578,7 @@
               <w:rPr>
                 <w:noProof/>
               </w:rPr>
-              <w:instrText xml:space="preserve"> PAGEREF _Toc243655236 \h </w:instrText>
+              <w:instrText xml:space="preserve"> PAGEREF _Toc243730354 \h </w:instrText>
             </w:r>
             <w:r>
               <w:rPr>
@@ -1620,7 +1620,7 @@
               <w14:ligatures w14:val="standardContextual"/>
             </w:rPr>
           </w:pPr>
-          <w:hyperlink w:anchor="_Toc243655237" w:history="1">
+          <w:hyperlink w:anchor="_Toc243730355" w:history="1">
             <w:r>
               <w:rPr>
                 <w:rStyle w:val="Lienhypertexte"/>
@@ -1646,7 +1646,7 @@
               <w:rPr>
                 <w:noProof/>
               </w:rPr>
-              <w:instrText xml:space="preserve"> PAGEREF _Toc243655237 \h </w:instrText>
+              <w:instrText xml:space="preserve"> PAGEREF _Toc243730355 \h </w:instrText>
             </w:r>
             <w:r>
               <w:rPr>
@@ -1688,7 +1688,7 @@
               <w14:ligatures w14:val="standardContextual"/>
             </w:rPr>
           </w:pPr>
-          <w:hyperlink w:anchor="_Toc243655238" w:history="1">
+          <w:hyperlink w:anchor="_Toc243730356" w:history="1">
             <w:r>
               <w:rPr>
                 <w:rStyle w:val="Lienhypertexte"/>
@@ -1714,7 +1714,7 @@
               <w:rPr>
                 <w:noProof/>
               </w:rPr>
-              <w:instrText xml:space="preserve"> PAGEREF _Toc243655238 \h </w:instrText>
+              <w:instrText xml:space="preserve"> PAGEREF _Toc243730356 \h </w:instrText>
             </w:r>
             <w:r>
               <w:rPr>
@@ -1756,7 +1756,7 @@
               <w14:ligatures w14:val="standardContextual"/>
             </w:rPr>
           </w:pPr>
-          <w:hyperlink w:anchor="_Toc243655239" w:history="1">
+          <w:hyperlink w:anchor="_Toc243730357" w:history="1">
             <w:r>
               <w:rPr>
                 <w:rStyle w:val="Lienhypertexte"/>
@@ -1782,7 +1782,7 @@
               <w:rPr>
                 <w:noProof/>
               </w:rPr>
-              <w:instrText xml:space="preserve"> PAGEREF _Toc243655239 \h </w:instrText>
+              <w:instrText xml:space="preserve"> PAGEREF _Toc243730357 \h </w:instrText>
             </w:r>
             <w:r>
               <w:rPr>
@@ -1824,7 +1824,7 @@
               <w14:ligatures w14:val="standardContextual"/>
             </w:rPr>
           </w:pPr>
-          <w:hyperlink w:anchor="_Toc243655240" w:history="1">
+          <w:hyperlink w:anchor="_Toc243730358" w:history="1">
             <w:r>
               <w:rPr>
                 <w:rStyle w:val="Lienhypertexte"/>
@@ -1850,7 +1850,7 @@
               <w:rPr>
                 <w:noProof/>
               </w:rPr>
-              <w:instrText xml:space="preserve"> PAGEREF _Toc243655240 \h </w:instrText>
+              <w:instrText xml:space="preserve"> PAGEREF _Toc243730358 \h </w:instrText>
             </w:r>
             <w:r>
               <w:rPr>
@@ -1892,7 +1892,7 @@
               <w14:ligatures w14:val="standardContextual"/>
             </w:rPr>
           </w:pPr>
-          <w:hyperlink w:anchor="_Toc243655241" w:history="1">
+          <w:hyperlink w:anchor="_Toc243730359" w:history="1">
             <w:r>
               <w:rPr>
                 <w:rStyle w:val="Lienhypertexte"/>
@@ -1918,7 +1918,7 @@
               <w:rPr>
                 <w:noProof/>
               </w:rPr>
-              <w:instrText xml:space="preserve"> PAGEREF _Toc243655241 \h </w:instrText>
+              <w:instrText xml:space="preserve"> PAGEREF _Toc243730359 \h </w:instrText>
             </w:r>
             <w:r>
               <w:rPr>
@@ -1960,7 +1960,7 @@
               <w14:ligatures w14:val="standardContextual"/>
             </w:rPr>
           </w:pPr>
-          <w:hyperlink w:anchor="_Toc243655242" w:history="1">
+          <w:hyperlink w:anchor="_Toc243730360" w:history="1">
             <w:r>
               <w:rPr>
                 <w:rStyle w:val="Lienhypertexte"/>
@@ -1986,7 +1986,7 @@
               <w:rPr>
                 <w:noProof/>
               </w:rPr>
-              <w:instrText xml:space="preserve"> PAGEREF _Toc243655242 \h </w:instrText>
+              <w:instrText xml:space="preserve"> PAGEREF _Toc243730360 \h </w:instrText>
             </w:r>
             <w:r>
               <w:rPr>
@@ -2028,7 +2028,7 @@
               <w14:ligatures w14:val="standardContextual"/>
             </w:rPr>
           </w:pPr>
-          <w:hyperlink w:anchor="_Toc243655243" w:history="1">
+          <w:hyperlink w:anchor="_Toc243730361" w:history="1">
             <w:r>
               <w:rPr>
                 <w:rStyle w:val="Lienhypertexte"/>
@@ -2054,7 +2054,7 @@
               <w:rPr>
                 <w:noProof/>
               </w:rPr>
-              <w:instrText xml:space="preserve"> PAGEREF _Toc243655243 \h </w:instrText>
+              <w:instrText xml:space="preserve"> PAGEREF _Toc243730361 \h </w:instrText>
             </w:r>
             <w:r>
               <w:rPr>
@@ -2096,7 +2096,7 @@
               <w14:ligatures w14:val="standardContextual"/>
             </w:rPr>
           </w:pPr>
-          <w:hyperlink w:anchor="_Toc243655244" w:history="1">
+          <w:hyperlink w:anchor="_Toc243730362" w:history="1">
             <w:r>
               <w:rPr>
                 <w:rStyle w:val="Lienhypertexte"/>
@@ -2122,7 +2122,7 @@
               <w:rPr>
                 <w:noProof/>
               </w:rPr>
-              <w:instrText xml:space="preserve"> PAGEREF _Toc243655244 \h </w:instrText>
+              <w:instrText xml:space="preserve"> PAGEREF _Toc243730362 \h </w:instrText>
             </w:r>
             <w:r>
               <w:rPr>
@@ -2164,7 +2164,7 @@
               <w14:ligatures w14:val="standardContextual"/>
             </w:rPr>
           </w:pPr>
-          <w:hyperlink w:anchor="_Toc243655245" w:history="1">
+          <w:hyperlink w:anchor="_Toc243730363" w:history="1">
             <w:r>
               <w:rPr>
                 <w:rStyle w:val="Lienhypertexte"/>
@@ -2190,7 +2190,7 @@
               <w:rPr>
                 <w:noProof/>
               </w:rPr>
-              <w:instrText xml:space="preserve"> PAGEREF _Toc243655245 \h </w:instrText>
+              <w:instrText xml:space="preserve"> PAGEREF _Toc243730363 \h </w:instrText>
             </w:r>
             <w:r>
               <w:rPr>
@@ -2232,7 +2232,7 @@
               <w14:ligatures w14:val="standardContextual"/>
             </w:rPr>
           </w:pPr>
-          <w:hyperlink w:anchor="_Toc243655246" w:history="1">
+          <w:hyperlink w:anchor="_Toc243730364" w:history="1">
             <w:r>
               <w:rPr>
                 <w:rStyle w:val="Lienhypertexte"/>
@@ -2258,7 +2258,7 @@
               <w:rPr>
                 <w:noProof/>
               </w:rPr>
-              <w:instrText xml:space="preserve"> PAGEREF _Toc243655246 \h </w:instrText>
+              <w:instrText xml:space="preserve"> PAGEREF _Toc243730364 \h </w:instrText>
             </w:r>
             <w:r>
               <w:rPr>
@@ -2300,7 +2300,7 @@
               <w14:ligatures w14:val="standardContextual"/>
             </w:rPr>
           </w:pPr>
-          <w:hyperlink w:anchor="_Toc243655247" w:history="1">
+          <w:hyperlink w:anchor="_Toc243730365" w:history="1">
             <w:r>
               <w:rPr>
                 <w:rStyle w:val="Lienhypertexte"/>
@@ -2326,7 +2326,7 @@
               <w:rPr>
                 <w:noProof/>
               </w:rPr>
-              <w:instrText xml:space="preserve"> PAGEREF _Toc243655247 \h </w:instrText>
+              <w:instrText xml:space="preserve"> PAGEREF _Toc243730365 \h </w:instrText>
             </w:r>
             <w:r>
               <w:rPr>
@@ -2368,7 +2368,7 @@
               <w14:ligatures w14:val="standardContextual"/>
             </w:rPr>
           </w:pPr>
-          <w:hyperlink w:anchor="_Toc243655248" w:history="1">
+          <w:hyperlink w:anchor="_Toc243730366" w:history="1">
             <w:r>
               <w:rPr>
                 <w:rStyle w:val="Lienhypertexte"/>
@@ -2394,7 +2394,7 @@
               <w:rPr>
                 <w:noProof/>
               </w:rPr>
-              <w:instrText xml:space="preserve"> PAGEREF _Toc243655248 \h </w:instrText>
+              <w:instrText xml:space="preserve"> PAGEREF _Toc243730366 \h </w:instrText>
             </w:r>
             <w:r>
               <w:rPr>
@@ -2436,7 +2436,7 @@
               <w14:ligatures w14:val="standardContextual"/>
             </w:rPr>
           </w:pPr>
-          <w:hyperlink w:anchor="_Toc243655249" w:history="1">
+          <w:hyperlink w:anchor="_Toc243730367" w:history="1">
             <w:r>
               <w:rPr>
                 <w:rStyle w:val="Lienhypertexte"/>
@@ -2462,7 +2462,7 @@
               <w:rPr>
                 <w:noProof/>
               </w:rPr>
-              <w:instrText xml:space="preserve"> PAGEREF _Toc243655249 \h </w:instrText>
+              <w:instrText xml:space="preserve"> PAGEREF _Toc243730367 \h </w:instrText>
             </w:r>
             <w:r>
               <w:rPr>
@@ -2504,7 +2504,7 @@
               <w14:ligatures w14:val="standardContextual"/>
             </w:rPr>
           </w:pPr>
-          <w:hyperlink w:anchor="_Toc243655250" w:history="1">
+          <w:hyperlink w:anchor="_Toc243730368" w:history="1">
             <w:r>
               <w:rPr>
                 <w:rStyle w:val="Lienhypertexte"/>
@@ -2530,7 +2530,7 @@
               <w:rPr>
                 <w:noProof/>
               </w:rPr>
-              <w:instrText xml:space="preserve"> PAGEREF _Toc243655250 \h </w:instrText>
+              <w:instrText xml:space="preserve"> PAGEREF _Toc243730368 \h </w:instrText>
             </w:r>
             <w:r>
               <w:rPr>
@@ -2572,7 +2572,7 @@
               <w14:ligatures w14:val="standardContextual"/>
             </w:rPr>
           </w:pPr>
-          <w:hyperlink w:anchor="_Toc243655251" w:history="1">
+          <w:hyperlink w:anchor="_Toc243730369" w:history="1">
             <w:r>
               <w:rPr>
                 <w:rStyle w:val="Lienhypertexte"/>
@@ -2598,7 +2598,7 @@
               <w:rPr>
                 <w:noProof/>
               </w:rPr>
-              <w:instrText xml:space="preserve"> PAGEREF _Toc243655251 \h </w:instrText>
+              <w:instrText xml:space="preserve"> PAGEREF _Toc243730369 \h </w:instrText>
             </w:r>
             <w:r>
               <w:rPr>
@@ -2640,7 +2640,7 @@
               <w14:ligatures w14:val="standardContextual"/>
             </w:rPr>
           </w:pPr>
-          <w:hyperlink w:anchor="_Toc243655252" w:history="1">
+          <w:hyperlink w:anchor="_Toc243730370" w:history="1">
             <w:r>
               <w:rPr>
                 <w:rStyle w:val="Lienhypertexte"/>
@@ -2666,7 +2666,7 @@
               <w:rPr>
                 <w:noProof/>
               </w:rPr>
-              <w:instrText xml:space="preserve"> PAGEREF _Toc243655252 \h </w:instrText>
+              <w:instrText xml:space="preserve"> PAGEREF _Toc243730370 \h </w:instrText>
             </w:r>
             <w:r>
               <w:rPr>
@@ -2708,7 +2708,7 @@
               <w14:ligatures w14:val="standardContextual"/>
             </w:rPr>
           </w:pPr>
-          <w:hyperlink w:anchor="_Toc243655253" w:history="1">
+          <w:hyperlink w:anchor="_Toc243730371" w:history="1">
             <w:r>
               <w:rPr>
                 <w:rStyle w:val="Lienhypertexte"/>
@@ -2716,43 +2716,25 @@
                 <w:bCs/>
                 <w:noProof/>
               </w:rPr>
-              <w:t>Pour aller plus</w:t>
-            </w:r>
-            <w:r>
-              <w:rPr>
-                <w:rStyle w:val="Lienhypertexte"/>
-                <w:b/>
-                <w:bCs/>
+              <w:t>Pour aller plus loin</w:t>
+            </w:r>
+            <w:r>
+              <w:rPr>
                 <w:noProof/>
               </w:rPr>
-              <w:t xml:space="preserve"> </w:t>
-            </w:r>
-            <w:r>
-              <w:rPr>
-                <w:rStyle w:val="Lienhypertexte"/>
-                <w:b/>
-                <w:bCs/>
+              <w:tab/>
+            </w:r>
+            <w:r>
+              <w:rPr>
                 <w:noProof/>
               </w:rPr>
-              <w:t>loin</w:t>
+              <w:fldChar w:fldCharType="begin"/>
             </w:r>
             <w:r>
               <w:rPr>
                 <w:noProof/>
               </w:rPr>
-              <w:tab/>
-            </w:r>
-            <w:r>
-              <w:rPr>
-                <w:noProof/>
-              </w:rPr>
-              <w:fldChar w:fldCharType="begin"/>
-            </w:r>
-            <w:r>
-              <w:rPr>
-                <w:noProof/>
-              </w:rPr>
-              <w:instrText xml:space="preserve"> PAGEREF _Toc243655253 \h </w:instrText>
+              <w:instrText xml:space="preserve"> PAGEREF _Toc243730371 \h </w:instrText>
             </w:r>
             <w:r>
               <w:rPr>
@@ -2794,7 +2776,7 @@
               <w14:ligatures w14:val="standardContextual"/>
             </w:rPr>
           </w:pPr>
-          <w:hyperlink w:anchor="_Toc243655254" w:history="1">
+          <w:hyperlink w:anchor="_Toc243730372" w:history="1">
             <w:r>
               <w:rPr>
                 <w:rStyle w:val="Lienhypertexte"/>
@@ -2820,7 +2802,7 @@
               <w:rPr>
                 <w:noProof/>
               </w:rPr>
-              <w:instrText xml:space="preserve"> PAGEREF _Toc243655254 \h </w:instrText>
+              <w:instrText xml:space="preserve"> PAGEREF _Toc243730372 \h </w:instrText>
             </w:r>
             <w:r>
               <w:rPr>
@@ -2887,7 +2869,7 @@
         <w:spacing w:after="360"/>
         <w:jc w:val="center"/>
       </w:pPr>
-      <w:bookmarkStart w:id="0" w:name="_Toc243655215"/>
+      <w:bookmarkStart w:id="0" w:name="_Toc243730333"/>
       <w:r>
         <w:rPr>
           <w:b/>
@@ -2940,7 +2922,7 @@
         <w:spacing w:before="360" w:after="160"/>
       </w:pPr>
       <w:bookmarkStart w:id="1" w:name="sec-INI-1"/>
-      <w:bookmarkStart w:id="2" w:name="_Toc243655216"/>
+      <w:bookmarkStart w:id="2" w:name="_Toc243730334"/>
       <w:r>
         <w:rPr>
           <w:b/>
@@ -4591,7 +4573,7 @@
         <w:spacing w:before="360" w:after="160"/>
       </w:pPr>
       <w:bookmarkStart w:id="3" w:name="sec-INI-2"/>
-      <w:bookmarkStart w:id="4" w:name="_Toc243655217"/>
+      <w:bookmarkStart w:id="4" w:name="_Toc243730335"/>
       <w:r>
         <w:rPr>
           <w:b/>
@@ -5342,6 +5324,45 @@
           <w:bCs/>
           <w:color w:val="595959"/>
         </w:rPr>
+        <w:t>Les tests de module et leurs badges</w:t>
+      </w:r>
+    </w:p>
+    <w:p>
+      <w:pPr>
+        <w:spacing w:after="120"/>
+      </w:pPr>
+      <w:r>
+        <w:t>Chaque module a, sur Moodle, un test : huit questions tirées au hasard parmi quinze. Après chaque réponse, vous voyez si elle est juste et, sinon, la partie du support à revoir. Le test est réussi à 6 sur 8, et vous pouvez le refaire autant de fois que vous le voulez : les questions changent d'une tentative à l'autre.</w:t>
+      </w:r>
+    </w:p>
+    <w:p>
+      <w:pPr>
+        <w:spacing w:after="120"/>
+      </w:pPr>
+      <w:r>
+        <w:t>Chaque test réussi vous donne un badge. Quatre badges d'étape marquent les grandes parties du cours, et un dernier, « Java, de bout en bout », la réussite des quatorze tests. Un tout premier badge, « Pied à l'étrier », vous accueille dès que vous avez téléchargé le projet de départ.</w:t>
+      </w:r>
+    </w:p>
+    <w:p>
+      <w:pPr>
+        <w:spacing w:after="120"/>
+      </w:pPr>
+      <w:r>
+        <w:t>Ces badges ne comptent pas dans la note. Ce sont des repères, pour voir où vous en êtes et ce qu'il vous reste à revoir : prenez-les comme un encouragement, à votre rythme.</w:t>
+      </w:r>
+    </w:p>
+    <w:p>
+      <w:pPr>
+        <w:pStyle w:val="Titre3"/>
+        <w:keepNext/>
+        <w:spacing w:before="240" w:after="100"/>
+      </w:pPr>
+      <w:r>
+        <w:rPr>
+          <w:b/>
+          <w:bCs/>
+          <w:color w:val="595959"/>
+        </w:rPr>
         <w:t>Ce support de cours</w:t>
       </w:r>
     </w:p>
@@ -5360,7 +5381,7 @@
         <w:spacing w:before="360" w:after="160"/>
       </w:pPr>
       <w:bookmarkStart w:id="5" w:name="sec-INI-3"/>
-      <w:bookmarkStart w:id="6" w:name="_Toc243655218"/>
+      <w:bookmarkStart w:id="6" w:name="_Toc243730336"/>
       <w:r>
         <w:rPr>
           <w:b/>
@@ -5956,6 +5977,7 @@
         <w:spacing w:after="120"/>
       </w:pPr>
       <w:r>
+        <w:lastRenderedPageBreak/>
         <w:t xml:space="preserve">Le </w:t>
       </w:r>
       <w:r>
@@ -6056,11 +6078,7 @@
         <w:t>mémento Clean Code</w:t>
       </w:r>
       <w:r>
-        <w:t xml:space="preserve"> rassemble 37 règles simples, en sept sections (noms, méthodes, commentaires, objets, erreurs, tests, classes), pour écrire du code qu'un autre développeur, ou vous-même dans six mois, </w:t>
-      </w:r>
-      <w:r>
-        <w:lastRenderedPageBreak/>
-        <w:t xml:space="preserve">comprendra sans effort. Un programme qui fonctionne n'est pas forcément un programme lisible. Ces règles s'inspirent du livre </w:t>
+        <w:t xml:space="preserve"> rassemble 37 règles simples, en sept sections (noms, méthodes, commentaires, objets, erreurs, tests, classes), pour écrire du code qu'un autre développeur, ou vous-même dans six mois, comprendra sans effort. Un programme qui fonctionne n'est pas forcément un programme lisible. Ces règles s'inspirent du livre </w:t>
       </w:r>
       <w:r>
         <w:rPr>
@@ -6530,7 +6548,7 @@
         <w:keepNext/>
         <w:spacing w:before="360" w:after="160"/>
       </w:pPr>
-      <w:bookmarkStart w:id="7" w:name="_Toc243655219"/>
+      <w:bookmarkStart w:id="7" w:name="_Toc243730337"/>
       <w:r>
         <w:rPr>
           <w:b/>
@@ -6656,7 +6674,7 @@
         <w:spacing w:after="360"/>
         <w:jc w:val="center"/>
       </w:pPr>
-      <w:bookmarkStart w:id="8" w:name="_Toc243655220"/>
+      <w:bookmarkStart w:id="8" w:name="_Toc243730338"/>
       <w:r>
         <w:rPr>
           <w:b/>
@@ -6690,7 +6708,7 @@
         <w:keepNext/>
         <w:spacing w:before="360" w:after="160"/>
       </w:pPr>
-      <w:bookmarkStart w:id="9" w:name="_Toc243655221"/>
+      <w:bookmarkStart w:id="9" w:name="_Toc243730339"/>
       <w:r>
         <w:rPr>
           <w:b/>
@@ -6890,7 +6908,7 @@
         <w:keepNext/>
         <w:spacing w:before="360" w:after="160"/>
       </w:pPr>
-      <w:bookmarkStart w:id="10" w:name="_Toc243655222"/>
+      <w:bookmarkStart w:id="10" w:name="_Toc243730340"/>
       <w:r>
         <w:rPr>
           <w:b/>
@@ -9674,7 +9692,7 @@
         <w:keepNext/>
         <w:spacing w:before="360" w:after="160"/>
       </w:pPr>
-      <w:bookmarkStart w:id="11" w:name="_Toc243655223"/>
+      <w:bookmarkStart w:id="11" w:name="_Toc243730341"/>
       <w:r>
         <w:rPr>
           <w:b/>
@@ -10023,7 +10041,7 @@
         <w:keepNext/>
         <w:spacing w:before="360" w:after="160"/>
       </w:pPr>
-      <w:bookmarkStart w:id="15" w:name="_Toc243655224"/>
+      <w:bookmarkStart w:id="15" w:name="_Toc243730342"/>
       <w:r>
         <w:rPr>
           <w:b/>
@@ -10171,7 +10189,7 @@
           <w:noProof/>
         </w:rPr>
         <w:drawing>
-          <wp:inline distT="0" distB="0" distL="0" distR="0" wp14:anchorId="7E7D37D2" wp14:editId="24D35F7D">
+          <wp:inline distT="0" distB="0" distL="0" distR="0" wp14:anchorId="694E77C2">
             <wp:extent cx="5715000" cy="2714625"/>
             <wp:effectExtent l="0" t="0" r="0" b="0"/>
             <wp:docPr id="2" name="Image 2"/>
@@ -10463,7 +10481,7 @@
           <w:noProof/>
         </w:rPr>
         <w:drawing>
-          <wp:inline distT="0" distB="0" distL="0" distR="0" wp14:anchorId="5C02FCF9" wp14:editId="79AFCFFE">
+          <wp:inline distT="0" distB="0" distL="0" distR="0" wp14:anchorId="02554032">
             <wp:extent cx="3957637" cy="3044336"/>
             <wp:effectExtent l="0" t="0" r="0" b="0"/>
             <wp:docPr id="3" name="Image 3"/>
@@ -10665,7 +10683,7 @@
           <w:noProof/>
         </w:rPr>
         <w:drawing>
-          <wp:inline distT="0" distB="0" distL="0" distR="0" wp14:anchorId="68CB46EC" wp14:editId="596CAB1E">
+          <wp:inline distT="0" distB="0" distL="0" distR="0" wp14:anchorId="1B8C752A">
             <wp:extent cx="5715000" cy="3171825"/>
             <wp:effectExtent l="0" t="0" r="0" b="0"/>
             <wp:docPr id="4" name="Image 4"/>
@@ -10749,7 +10767,7 @@
         <w:keepNext/>
         <w:spacing w:before="360" w:after="160"/>
       </w:pPr>
-      <w:bookmarkStart w:id="19" w:name="_Toc243655225"/>
+      <w:bookmarkStart w:id="19" w:name="_Toc243730343"/>
       <w:r>
         <w:rPr>
           <w:b/>
@@ -10802,7 +10820,7 @@
           <w:noProof/>
         </w:rPr>
         <w:drawing>
-          <wp:inline distT="0" distB="0" distL="0" distR="0" wp14:anchorId="38ED8081" wp14:editId="0A67B034">
+          <wp:inline distT="0" distB="0" distL="0" distR="0" wp14:anchorId="76778C2C">
             <wp:extent cx="5715000" cy="3581400"/>
             <wp:effectExtent l="0" t="0" r="0" b="0"/>
             <wp:docPr id="5" name="Image 5"/>
@@ -10993,7 +11011,7 @@
           <w:noProof/>
         </w:rPr>
         <w:drawing>
-          <wp:inline distT="0" distB="0" distL="0" distR="0" wp14:anchorId="46DF7E7A" wp14:editId="0703E205">
+          <wp:inline distT="0" distB="0" distL="0" distR="0" wp14:anchorId="63496280">
             <wp:extent cx="2724150" cy="3810000"/>
             <wp:effectExtent l="0" t="0" r="0" b="0"/>
             <wp:docPr id="6" name="Image 6"/>
@@ -11486,7 +11504,7 @@
         </w:rPr>
         <w:lastRenderedPageBreak/>
         <w:drawing>
-          <wp:inline distT="0" distB="0" distL="0" distR="0" wp14:anchorId="3B02892C" wp14:editId="6B552F07">
+          <wp:inline distT="0" distB="0" distL="0" distR="0" wp14:anchorId="1154C5B5">
             <wp:extent cx="5038725" cy="1885950"/>
             <wp:effectExtent l="0" t="0" r="0" b="0"/>
             <wp:docPr id="7" name="Image 7"/>
@@ -11596,7 +11614,7 @@
           <w:noProof/>
         </w:rPr>
         <w:drawing>
-          <wp:inline distT="0" distB="0" distL="0" distR="0" wp14:anchorId="3DFA1BC6" wp14:editId="3F085AEA">
+          <wp:inline distT="0" distB="0" distL="0" distR="0" wp14:anchorId="7C31783B">
             <wp:extent cx="2564606" cy="1712251"/>
             <wp:effectExtent l="0" t="0" r="0" b="0"/>
             <wp:docPr id="8" name="Image 8"/>
@@ -11710,7 +11728,7 @@
           <w:noProof/>
         </w:rPr>
         <w:drawing>
-          <wp:inline distT="0" distB="0" distL="0" distR="0" wp14:anchorId="3E9490A2" wp14:editId="647D7795">
+          <wp:inline distT="0" distB="0" distL="0" distR="0" wp14:anchorId="10DE7A94">
             <wp:extent cx="4029075" cy="3421719"/>
             <wp:effectExtent l="0" t="0" r="0" b="0"/>
             <wp:docPr id="9" name="Image 9"/>
@@ -12792,7 +12810,7 @@
         <w:keepNext/>
         <w:spacing w:before="360" w:after="160"/>
       </w:pPr>
-      <w:bookmarkStart w:id="24" w:name="_Toc243655226"/>
+      <w:bookmarkStart w:id="24" w:name="_Toc243730344"/>
       <w:r>
         <w:rPr>
           <w:b/>
@@ -13076,7 +13094,7 @@
           <w:noProof/>
         </w:rPr>
         <w:drawing>
-          <wp:inline distT="0" distB="0" distL="0" distR="0" wp14:anchorId="3C617C13" wp14:editId="02E1C2CB">
+          <wp:inline distT="0" distB="0" distL="0" distR="0" wp14:anchorId="42113F15">
             <wp:extent cx="1385887" cy="1194466"/>
             <wp:effectExtent l="0" t="0" r="0" b="0"/>
             <wp:docPr id="10" name="Image 10"/>
@@ -13730,7 +13748,7 @@
         </w:rPr>
         <w:lastRenderedPageBreak/>
         <w:drawing>
-          <wp:inline distT="0" distB="0" distL="0" distR="0" wp14:anchorId="29FA89B7" wp14:editId="0B81EC28">
+          <wp:inline distT="0" distB="0" distL="0" distR="0" wp14:anchorId="2AADCEC3">
             <wp:extent cx="5267325" cy="3810000"/>
             <wp:effectExtent l="0" t="0" r="0" b="0"/>
             <wp:docPr id="11" name="Image 11"/>
@@ -13905,7 +13923,7 @@
           <w:noProof/>
         </w:rPr>
         <w:drawing>
-          <wp:inline distT="0" distB="0" distL="0" distR="0" wp14:anchorId="124D6744" wp14:editId="3E7F600A">
+          <wp:inline distT="0" distB="0" distL="0" distR="0" wp14:anchorId="68E1E947">
             <wp:extent cx="2876550" cy="1200150"/>
             <wp:effectExtent l="0" t="0" r="0" b="0"/>
             <wp:docPr id="12" name="Image 12"/>
@@ -13979,7 +13997,7 @@
           <w:noProof/>
         </w:rPr>
         <w:drawing>
-          <wp:inline distT="0" distB="0" distL="0" distR="0" wp14:anchorId="37942C49" wp14:editId="4A73BF64">
+          <wp:inline distT="0" distB="0" distL="0" distR="0" wp14:anchorId="3DBF2BD9">
             <wp:extent cx="2876550" cy="1133475"/>
             <wp:effectExtent l="0" t="0" r="0" b="0"/>
             <wp:docPr id="13" name="Image 13"/>
@@ -14078,7 +14096,7 @@
         </w:rPr>
         <w:lastRenderedPageBreak/>
         <w:drawing>
-          <wp:inline distT="0" distB="0" distL="0" distR="0" wp14:anchorId="5582351F" wp14:editId="7F3CBF46">
+          <wp:inline distT="0" distB="0" distL="0" distR="0" wp14:anchorId="6A02029D">
             <wp:extent cx="2876550" cy="952500"/>
             <wp:effectExtent l="0" t="0" r="0" b="0"/>
             <wp:docPr id="14" name="Image 14"/>
@@ -14274,7 +14292,7 @@
         <w:keepNext/>
         <w:spacing w:before="360" w:after="160"/>
       </w:pPr>
-      <w:bookmarkStart w:id="30" w:name="_Toc243655227"/>
+      <w:bookmarkStart w:id="30" w:name="_Toc243730345"/>
       <w:r>
         <w:rPr>
           <w:b/>
@@ -14346,7 +14364,7 @@
           <w:noProof/>
         </w:rPr>
         <w:drawing>
-          <wp:inline distT="0" distB="0" distL="0" distR="0" wp14:anchorId="5882D88A" wp14:editId="2EBA0691">
+          <wp:inline distT="0" distB="0" distL="0" distR="0" wp14:anchorId="6A2B389E">
             <wp:extent cx="2876550" cy="533400"/>
             <wp:effectExtent l="0" t="0" r="0" b="0"/>
             <wp:docPr id="15" name="Image 15"/>
@@ -14553,7 +14571,7 @@
         </w:rPr>
         <w:lastRenderedPageBreak/>
         <w:drawing>
-          <wp:inline distT="0" distB="0" distL="0" distR="0" wp14:anchorId="319AB9C0" wp14:editId="17D4C2C2">
+          <wp:inline distT="0" distB="0" distL="0" distR="0" wp14:anchorId="172801B5">
             <wp:extent cx="5715000" cy="3581400"/>
             <wp:effectExtent l="0" t="0" r="0" b="0"/>
             <wp:docPr id="16" name="Image 16"/>
@@ -14650,7 +14668,7 @@
           <w:noProof/>
         </w:rPr>
         <w:drawing>
-          <wp:inline distT="0" distB="0" distL="0" distR="0" wp14:anchorId="5840554E" wp14:editId="37158075">
+          <wp:inline distT="0" distB="0" distL="0" distR="0" wp14:anchorId="74D63D57">
             <wp:extent cx="5715000" cy="3581400"/>
             <wp:effectExtent l="0" t="0" r="0" b="0"/>
             <wp:docPr id="17" name="Image 17"/>
@@ -14868,7 +14886,7 @@
           <w:noProof/>
         </w:rPr>
         <w:drawing>
-          <wp:inline distT="0" distB="0" distL="0" distR="0" wp14:anchorId="4EEDCA4A" wp14:editId="13766528">
+          <wp:inline distT="0" distB="0" distL="0" distR="0" wp14:anchorId="59FC2279">
             <wp:extent cx="5200650" cy="3810000"/>
             <wp:effectExtent l="0" t="0" r="0" b="0"/>
             <wp:docPr id="18" name="Image 18"/>
@@ -15004,7 +15022,7 @@
         </w:rPr>
         <w:lastRenderedPageBreak/>
         <w:drawing>
-          <wp:inline distT="0" distB="0" distL="0" distR="0" wp14:anchorId="40137511" wp14:editId="457ED63B">
+          <wp:inline distT="0" distB="0" distL="0" distR="0" wp14:anchorId="38C35D24">
             <wp:extent cx="5715000" cy="3581400"/>
             <wp:effectExtent l="0" t="0" r="0" b="0"/>
             <wp:docPr id="19" name="Image 19"/>
@@ -15220,7 +15238,7 @@
           <w:noProof/>
         </w:rPr>
         <w:drawing>
-          <wp:inline distT="0" distB="0" distL="0" distR="0" wp14:anchorId="2DED7318" wp14:editId="09653B82">
+          <wp:inline distT="0" distB="0" distL="0" distR="0" wp14:anchorId="39D8F81C">
             <wp:extent cx="5715000" cy="1762125"/>
             <wp:effectExtent l="0" t="0" r="0" b="0"/>
             <wp:docPr id="20" name="Image 20"/>
@@ -15908,7 +15926,7 @@
         <w:keepNext/>
         <w:spacing w:before="360" w:after="160"/>
       </w:pPr>
-      <w:bookmarkStart w:id="35" w:name="_Toc243655228"/>
+      <w:bookmarkStart w:id="35" w:name="_Toc243730346"/>
       <w:r>
         <w:rPr>
           <w:b/>
@@ -16058,7 +16076,7 @@
           <w:noProof/>
         </w:rPr>
         <w:drawing>
-          <wp:inline distT="0" distB="0" distL="0" distR="0" wp14:anchorId="0BA8B143" wp14:editId="61A5124F">
+          <wp:inline distT="0" distB="0" distL="0" distR="0" wp14:anchorId="53B30F54">
             <wp:extent cx="3800475" cy="2071258"/>
             <wp:effectExtent l="0" t="0" r="0" b="0"/>
             <wp:docPr id="21" name="Image 21"/>
@@ -16355,7 +16373,7 @@
         <w:keepNext/>
         <w:spacing w:before="360" w:after="160"/>
       </w:pPr>
-      <w:bookmarkStart w:id="39" w:name="_Toc243655229"/>
+      <w:bookmarkStart w:id="39" w:name="_Toc243730347"/>
       <w:r>
         <w:rPr>
           <w:b/>
@@ -16528,7 +16546,7 @@
           <w:noProof/>
         </w:rPr>
         <w:drawing>
-          <wp:inline distT="0" distB="0" distL="0" distR="0" wp14:anchorId="14BC38AB" wp14:editId="13D6B50A">
+          <wp:inline distT="0" distB="0" distL="0" distR="0" wp14:anchorId="175FFC75">
             <wp:extent cx="3752850" cy="3810000"/>
             <wp:effectExtent l="0" t="0" r="0" b="0"/>
             <wp:docPr id="22" name="Image 22"/>
@@ -16662,7 +16680,7 @@
         <w:keepNext/>
         <w:spacing w:before="360" w:after="160"/>
       </w:pPr>
-      <w:bookmarkStart w:id="43" w:name="_Toc243655230"/>
+      <w:bookmarkStart w:id="43" w:name="_Toc243730348"/>
       <w:r>
         <w:rPr>
           <w:b/>
@@ -19452,7 +19470,7 @@
         </w:rPr>
         <w:lastRenderedPageBreak/>
         <w:drawing>
-          <wp:inline distT="0" distB="0" distL="0" distR="0" wp14:anchorId="2EEC0DF6" wp14:editId="30E05B3A">
+          <wp:inline distT="0" distB="0" distL="0" distR="0" wp14:anchorId="5864E068">
             <wp:extent cx="2968228" cy="3430922"/>
             <wp:effectExtent l="0" t="0" r="0" b="0"/>
             <wp:docPr id="23" name="Image 23"/>
@@ -19632,7 +19650,7 @@
           <w:noProof/>
         </w:rPr>
         <w:drawing>
-          <wp:inline distT="0" distB="0" distL="0" distR="0" wp14:anchorId="2A189723" wp14:editId="0C6AF61B">
+          <wp:inline distT="0" distB="0" distL="0" distR="0" wp14:anchorId="3101CFB2">
             <wp:extent cx="2876550" cy="2543175"/>
             <wp:effectExtent l="0" t="0" r="0" b="0"/>
             <wp:docPr id="24" name="Image 24"/>
@@ -19844,7 +19862,7 @@
         </w:rPr>
         <w:lastRenderedPageBreak/>
         <w:drawing>
-          <wp:inline distT="0" distB="0" distL="0" distR="0" wp14:anchorId="7E701BDB" wp14:editId="2DE9ADA6">
+          <wp:inline distT="0" distB="0" distL="0" distR="0" wp14:anchorId="2D89B84E">
             <wp:extent cx="3600450" cy="3028950"/>
             <wp:effectExtent l="0" t="0" r="0" b="0"/>
             <wp:docPr id="25" name="Image 25"/>
@@ -20433,7 +20451,7 @@
         <w:keepNext/>
         <w:spacing w:before="360" w:after="160"/>
       </w:pPr>
-      <w:bookmarkStart w:id="48" w:name="_Toc243655231"/>
+      <w:bookmarkStart w:id="48" w:name="_Toc243730349"/>
       <w:r>
         <w:rPr>
           <w:b/>
@@ -21188,7 +21206,7 @@
         </w:rPr>
         <w:lastRenderedPageBreak/>
         <w:drawing>
-          <wp:inline distT="0" distB="0" distL="0" distR="0" wp14:anchorId="78B79457" wp14:editId="35C2C20C">
+          <wp:inline distT="0" distB="0" distL="0" distR="0" wp14:anchorId="17705D9B">
             <wp:extent cx="4943475" cy="3810000"/>
             <wp:effectExtent l="0" t="0" r="0" b="0"/>
             <wp:docPr id="26" name="Image 26"/>
@@ -22274,13 +22292,17 @@
         <w:shd w:val="clear" w:color="auto" w:fill="F2F2F2"/>
         <w:spacing w:after="160"/>
         <w:ind w:left="220"/>
-      </w:pPr>
-      <w:r>
-        <w:rPr>
-          <w:rFonts w:ascii="Consolas" w:hAnsi="Consolas" w:cs="Consolas"/>
-          <w:color w:val="E97132" w:themeColor="accent2"/>
-          <w:sz w:val="18"/>
-          <w:szCs w:val="18"/>
+        <w:rPr>
+          <w:lang w:val="nl-BE"/>
+        </w:rPr>
+      </w:pPr>
+      <w:r>
+        <w:rPr>
+          <w:rFonts w:ascii="Consolas" w:hAnsi="Consolas" w:cs="Consolas"/>
+          <w:color w:val="E97132" w:themeColor="accent2"/>
+          <w:sz w:val="18"/>
+          <w:szCs w:val="18"/>
+          <w:lang w:val="nl-BE"/>
         </w:rPr>
         <w:t>Project files cannot be watched (are they under network mount?)</w:t>
       </w:r>
@@ -22739,7 +22761,7 @@
         <w:spacing w:after="360"/>
         <w:jc w:val="center"/>
       </w:pPr>
-      <w:bookmarkStart w:id="60" w:name="_Toc243655232"/>
+      <w:bookmarkStart w:id="60" w:name="_Toc243730350"/>
       <w:r>
         <w:rPr>
           <w:b/>
@@ -22773,7 +22795,7 @@
         <w:keepNext/>
         <w:spacing w:before="360" w:after="160"/>
       </w:pPr>
-      <w:bookmarkStart w:id="61" w:name="_Toc243655233"/>
+      <w:bookmarkStart w:id="61" w:name="_Toc243730351"/>
       <w:r>
         <w:rPr>
           <w:b/>
@@ -22864,7 +22886,7 @@
         <w:keepNext/>
         <w:spacing w:before="360" w:after="160"/>
       </w:pPr>
-      <w:bookmarkStart w:id="62" w:name="_Toc243655234"/>
+      <w:bookmarkStart w:id="62" w:name="_Toc243730352"/>
       <w:r>
         <w:rPr>
           <w:b/>
@@ -24748,7 +24770,7 @@
         <w:keepNext/>
         <w:spacing w:before="360" w:after="160"/>
       </w:pPr>
-      <w:bookmarkStart w:id="63" w:name="_Toc243655235"/>
+      <w:bookmarkStart w:id="63" w:name="_Toc243730353"/>
       <w:r>
         <w:rPr>
           <w:b/>
@@ -26064,7 +26086,7 @@
         <w:keepNext/>
         <w:spacing w:before="360" w:after="160"/>
       </w:pPr>
-      <w:bookmarkStart w:id="68" w:name="_Toc243655236"/>
+      <w:bookmarkStart w:id="68" w:name="_Toc243730354"/>
       <w:r>
         <w:rPr>
           <w:b/>
@@ -28121,7 +28143,7 @@
         <w:keepNext/>
         <w:spacing w:before="360" w:after="160"/>
       </w:pPr>
-      <w:bookmarkStart w:id="73" w:name="_Toc243655237"/>
+      <w:bookmarkStart w:id="73" w:name="_Toc243730355"/>
       <w:r>
         <w:rPr>
           <w:b/>
@@ -28851,7 +28873,7 @@
         <w:keepNext/>
         <w:spacing w:before="360" w:after="160"/>
       </w:pPr>
-      <w:bookmarkStart w:id="78" w:name="_Toc243655238"/>
+      <w:bookmarkStart w:id="78" w:name="_Toc243730356"/>
       <w:r>
         <w:rPr>
           <w:b/>
@@ -29884,7 +29906,7 @@
         <w:keepNext/>
         <w:spacing w:before="360" w:after="160"/>
       </w:pPr>
-      <w:bookmarkStart w:id="83" w:name="_Toc243655239"/>
+      <w:bookmarkStart w:id="83" w:name="_Toc243730357"/>
       <w:r>
         <w:rPr>
           <w:b/>
@@ -31216,7 +31238,7 @@
         <w:keepNext/>
         <w:spacing w:before="360" w:after="160"/>
       </w:pPr>
-      <w:bookmarkStart w:id="89" w:name="_Toc243655240"/>
+      <w:bookmarkStart w:id="89" w:name="_Toc243730358"/>
       <w:r>
         <w:rPr>
           <w:b/>
@@ -31807,7 +31829,7 @@
         <w:keepNext/>
         <w:spacing w:before="360" w:after="160"/>
       </w:pPr>
-      <w:bookmarkStart w:id="92" w:name="_Toc243655241"/>
+      <w:bookmarkStart w:id="92" w:name="_Toc243730359"/>
       <w:r>
         <w:rPr>
           <w:b/>
@@ -32632,7 +32654,7 @@
         <w:spacing w:after="360"/>
         <w:jc w:val="center"/>
       </w:pPr>
-      <w:bookmarkStart w:id="96" w:name="_Toc243655242"/>
+      <w:bookmarkStart w:id="96" w:name="_Toc243730360"/>
       <w:r>
         <w:rPr>
           <w:b/>
@@ -32665,7 +32687,7 @@
         <w:pStyle w:val="Titre2"/>
         <w:spacing w:before="360" w:after="160"/>
       </w:pPr>
-      <w:bookmarkStart w:id="97" w:name="_Toc243655243"/>
+      <w:bookmarkStart w:id="97" w:name="_Toc243730361"/>
       <w:r>
         <w:rPr>
           <w:b/>
@@ -32791,7 +32813,7 @@
         <w:pStyle w:val="Titre2"/>
         <w:spacing w:before="360" w:after="160"/>
       </w:pPr>
-      <w:bookmarkStart w:id="98" w:name="_Toc243655244"/>
+      <w:bookmarkStart w:id="98" w:name="_Toc243730362"/>
       <w:r>
         <w:rPr>
           <w:b/>
@@ -35274,7 +35296,7 @@
         <w:pStyle w:val="Titre2"/>
         <w:spacing w:before="360" w:after="160"/>
       </w:pPr>
-      <w:bookmarkStart w:id="99" w:name="_Toc243655245"/>
+      <w:bookmarkStart w:id="99" w:name="_Toc243730363"/>
       <w:r>
         <w:rPr>
           <w:b/>
@@ -35652,28 +35674,45 @@
       <w:pPr>
         <w:shd w:val="clear" w:color="auto" w:fill="EDF5ED"/>
         <w:ind w:left="220"/>
-      </w:pPr>
-      <w:r>
-        <w:rPr>
-          <w:rFonts w:ascii="Consolas" w:hAnsi="Consolas" w:cs="Consolas"/>
-          <w:color w:val="E97132" w:themeColor="accent2"/>
-          <w:sz w:val="18"/>
-          <w:szCs w:val="18"/>
-        </w:rPr>
-        <w:t xml:space="preserve">    int resultYear       = resultMonths / 12;</w:t>
+        <w:rPr>
+          <w:lang w:val="nl-BE"/>
+        </w:rPr>
+      </w:pPr>
+      <w:r>
+        <w:rPr>
+          <w:rFonts w:ascii="Consolas" w:hAnsi="Consolas" w:cs="Consolas"/>
+          <w:color w:val="E97132" w:themeColor="accent2"/>
+          <w:sz w:val="18"/>
+          <w:szCs w:val="18"/>
+        </w:rPr>
+        <w:t xml:space="preserve">    </w:t>
+      </w:r>
+      <w:r>
+        <w:rPr>
+          <w:rFonts w:ascii="Consolas" w:hAnsi="Consolas" w:cs="Consolas"/>
+          <w:color w:val="E97132" w:themeColor="accent2"/>
+          <w:sz w:val="18"/>
+          <w:szCs w:val="18"/>
+          <w:lang w:val="nl-BE"/>
+        </w:rPr>
+        <w:t>int resultYear       = resultMonths / 12;</w:t>
       </w:r>
     </w:p>
     <w:p>
       <w:pPr>
         <w:shd w:val="clear" w:color="auto" w:fill="EDF5ED"/>
         <w:ind w:left="220"/>
-      </w:pPr>
-      <w:r>
-        <w:rPr>
-          <w:rFonts w:ascii="Consolas" w:hAnsi="Consolas" w:cs="Consolas"/>
-          <w:color w:val="E97132" w:themeColor="accent2"/>
-          <w:sz w:val="18"/>
-          <w:szCs w:val="18"/>
+        <w:rPr>
+          <w:lang w:val="nl-BE"/>
+        </w:rPr>
+      </w:pPr>
+      <w:r>
+        <w:rPr>
+          <w:rFonts w:ascii="Consolas" w:hAnsi="Consolas" w:cs="Consolas"/>
+          <w:color w:val="E97132" w:themeColor="accent2"/>
+          <w:sz w:val="18"/>
+          <w:szCs w:val="18"/>
+          <w:lang w:val="nl-BE"/>
         </w:rPr>
         <w:t xml:space="preserve">    int resultMonth      = resultMonths % 12 + JANUARY;</w:t>
       </w:r>
@@ -35682,13 +35721,17 @@
       <w:pPr>
         <w:shd w:val="clear" w:color="auto" w:fill="EDF5ED"/>
         <w:ind w:left="220"/>
-      </w:pPr>
-      <w:r>
-        <w:rPr>
-          <w:rFonts w:ascii="Consolas" w:hAnsi="Consolas" w:cs="Consolas"/>
-          <w:color w:val="E97132" w:themeColor="accent2"/>
-          <w:sz w:val="18"/>
-          <w:szCs w:val="18"/>
+        <w:rPr>
+          <w:lang w:val="nl-BE"/>
+        </w:rPr>
+      </w:pPr>
+      <w:r>
+        <w:rPr>
+          <w:rFonts w:ascii="Consolas" w:hAnsi="Consolas" w:cs="Consolas"/>
+          <w:color w:val="E97132" w:themeColor="accent2"/>
+          <w:sz w:val="18"/>
+          <w:szCs w:val="18"/>
+          <w:lang w:val="nl-BE"/>
         </w:rPr>
         <w:t xml:space="preserve">    int lastDay          = Date.lastDayOfMonth(resultMonth, resultYear);</w:t>
       </w:r>
@@ -35697,13 +35740,17 @@
       <w:pPr>
         <w:shd w:val="clear" w:color="auto" w:fill="EDF5ED"/>
         <w:ind w:left="220"/>
-      </w:pPr>
-      <w:r>
-        <w:rPr>
-          <w:rFonts w:ascii="Consolas" w:hAnsi="Consolas" w:cs="Consolas"/>
-          <w:color w:val="E97132" w:themeColor="accent2"/>
-          <w:sz w:val="18"/>
-          <w:szCs w:val="18"/>
+        <w:rPr>
+          <w:lang w:val="nl-BE"/>
+        </w:rPr>
+      </w:pPr>
+      <w:r>
+        <w:rPr>
+          <w:rFonts w:ascii="Consolas" w:hAnsi="Consolas" w:cs="Consolas"/>
+          <w:color w:val="E97132" w:themeColor="accent2"/>
+          <w:sz w:val="18"/>
+          <w:szCs w:val="18"/>
+          <w:lang w:val="nl-BE"/>
         </w:rPr>
         <w:t xml:space="preserve">    int resultDay        = Math.min(base.getDayOfMonth(), lastDay);</w:t>
       </w:r>
@@ -35712,13 +35759,17 @@
       <w:pPr>
         <w:shd w:val="clear" w:color="auto" w:fill="EDF5ED"/>
         <w:ind w:left="220"/>
-      </w:pPr>
-      <w:r>
-        <w:rPr>
-          <w:rFonts w:ascii="Consolas" w:hAnsi="Consolas" w:cs="Consolas"/>
-          <w:color w:val="E97132" w:themeColor="accent2"/>
-          <w:sz w:val="18"/>
-          <w:szCs w:val="18"/>
+        <w:rPr>
+          <w:lang w:val="nl-BE"/>
+        </w:rPr>
+      </w:pPr>
+      <w:r>
+        <w:rPr>
+          <w:rFonts w:ascii="Consolas" w:hAnsi="Consolas" w:cs="Consolas"/>
+          <w:color w:val="E97132" w:themeColor="accent2"/>
+          <w:sz w:val="18"/>
+          <w:szCs w:val="18"/>
+          <w:lang w:val="nl-BE"/>
         </w:rPr>
         <w:t xml:space="preserve">    return Date.createInstance(resultDay, resultMonth, resultYear);</w:t>
       </w:r>
@@ -38811,7 +38862,7 @@
         <w:pStyle w:val="Titre2"/>
         <w:spacing w:before="360" w:after="160"/>
       </w:pPr>
-      <w:bookmarkStart w:id="108" w:name="_Toc243655246"/>
+      <w:bookmarkStart w:id="108" w:name="_Toc243730364"/>
       <w:r>
         <w:rPr>
           <w:b/>
@@ -39302,28 +39353,45 @@
       <w:pPr>
         <w:shd w:val="clear" w:color="auto" w:fill="FBEDED"/>
         <w:ind w:left="220"/>
-      </w:pPr>
-      <w:r>
-        <w:rPr>
-          <w:rFonts w:ascii="Consolas" w:hAnsi="Consolas" w:cs="Consolas"/>
-          <w:color w:val="E97132" w:themeColor="accent2"/>
-          <w:sz w:val="18"/>
-          <w:szCs w:val="18"/>
-        </w:rPr>
-        <w:t xml:space="preserve">    } else {</w:t>
+        <w:rPr>
+          <w:lang w:val="nl-BE"/>
+        </w:rPr>
+      </w:pPr>
+      <w:r>
+        <w:rPr>
+          <w:rFonts w:ascii="Consolas" w:hAnsi="Consolas" w:cs="Consolas"/>
+          <w:color w:val="E97132" w:themeColor="accent2"/>
+          <w:sz w:val="18"/>
+          <w:szCs w:val="18"/>
+        </w:rPr>
+        <w:t xml:space="preserve">    </w:t>
+      </w:r>
+      <w:r>
+        <w:rPr>
+          <w:rFonts w:ascii="Consolas" w:hAnsi="Consolas" w:cs="Consolas"/>
+          <w:color w:val="E97132" w:themeColor="accent2"/>
+          <w:sz w:val="18"/>
+          <w:szCs w:val="18"/>
+          <w:lang w:val="nl-BE"/>
+        </w:rPr>
+        <w:t>} else {</w:t>
       </w:r>
     </w:p>
     <w:p>
       <w:pPr>
         <w:shd w:val="clear" w:color="auto" w:fill="FBEDED"/>
         <w:ind w:left="220"/>
-      </w:pPr>
-      <w:r>
-        <w:rPr>
-          <w:rFonts w:ascii="Consolas" w:hAnsi="Consolas" w:cs="Consolas"/>
-          <w:color w:val="E97132" w:themeColor="accent2"/>
-          <w:sz w:val="18"/>
-          <w:szCs w:val="18"/>
+        <w:rPr>
+          <w:lang w:val="nl-BE"/>
+        </w:rPr>
+      </w:pPr>
+      <w:r>
+        <w:rPr>
+          <w:rFonts w:ascii="Consolas" w:hAnsi="Consolas" w:cs="Consolas"/>
+          <w:color w:val="E97132" w:themeColor="accent2"/>
+          <w:sz w:val="18"/>
+          <w:szCs w:val="18"/>
+          <w:lang w:val="nl-BE"/>
         </w:rPr>
         <w:t xml:space="preserve">        for (String element : liste) {</w:t>
       </w:r>
@@ -39332,13 +39400,17 @@
       <w:pPr>
         <w:shd w:val="clear" w:color="auto" w:fill="FBEDED"/>
         <w:ind w:left="220"/>
-      </w:pPr>
-      <w:r>
-        <w:rPr>
-          <w:rFonts w:ascii="Consolas" w:hAnsi="Consolas" w:cs="Consolas"/>
-          <w:color w:val="E97132" w:themeColor="accent2"/>
-          <w:sz w:val="18"/>
-          <w:szCs w:val="18"/>
+        <w:rPr>
+          <w:lang w:val="nl-BE"/>
+        </w:rPr>
+      </w:pPr>
+      <w:r>
+        <w:rPr>
+          <w:rFonts w:ascii="Consolas" w:hAnsi="Consolas" w:cs="Consolas"/>
+          <w:color w:val="E97132" w:themeColor="accent2"/>
+          <w:sz w:val="18"/>
+          <w:szCs w:val="18"/>
+          <w:lang w:val="nl-BE"/>
         </w:rPr>
         <w:t xml:space="preserve">            if (!element.isEmpty()) {</w:t>
       </w:r>
@@ -39347,13 +39419,17 @@
       <w:pPr>
         <w:shd w:val="clear" w:color="auto" w:fill="FBEDED"/>
         <w:ind w:left="220"/>
-      </w:pPr>
-      <w:r>
-        <w:rPr>
-          <w:rFonts w:ascii="Consolas" w:hAnsi="Consolas" w:cs="Consolas"/>
-          <w:color w:val="E97132" w:themeColor="accent2"/>
-          <w:sz w:val="18"/>
-          <w:szCs w:val="18"/>
+        <w:rPr>
+          <w:lang w:val="nl-BE"/>
+        </w:rPr>
+      </w:pPr>
+      <w:r>
+        <w:rPr>
+          <w:rFonts w:ascii="Consolas" w:hAnsi="Consolas" w:cs="Consolas"/>
+          <w:color w:val="E97132" w:themeColor="accent2"/>
+          <w:sz w:val="18"/>
+          <w:szCs w:val="18"/>
+          <w:lang w:val="nl-BE"/>
         </w:rPr>
         <w:t xml:space="preserve">                System.out.println("- " + element);</w:t>
       </w:r>
@@ -39369,8 +39445,18 @@
           <w:color w:val="E97132" w:themeColor="accent2"/>
           <w:sz w:val="18"/>
           <w:szCs w:val="18"/>
-        </w:rPr>
-        <w:t xml:space="preserve">            }</w:t>
+          <w:lang w:val="nl-BE"/>
+        </w:rPr>
+        <w:t xml:space="preserve">            </w:t>
+      </w:r>
+      <w:r>
+        <w:rPr>
+          <w:rFonts w:ascii="Consolas" w:hAnsi="Consolas" w:cs="Consolas"/>
+          <w:color w:val="E97132" w:themeColor="accent2"/>
+          <w:sz w:val="18"/>
+          <w:szCs w:val="18"/>
+        </w:rPr>
+        <w:t>}</w:t>
       </w:r>
     </w:p>
     <w:p>
@@ -39575,28 +39661,45 @@
       <w:pPr>
         <w:shd w:val="clear" w:color="auto" w:fill="EDF5ED"/>
         <w:ind w:left="220"/>
-      </w:pPr>
-      <w:r>
-        <w:rPr>
-          <w:rFonts w:ascii="Consolas" w:hAnsi="Consolas" w:cs="Consolas"/>
-          <w:color w:val="E97132" w:themeColor="accent2"/>
-          <w:sz w:val="18"/>
-          <w:szCs w:val="18"/>
-        </w:rPr>
-        <w:t xml:space="preserve">    for (String element : liste) {</w:t>
+        <w:rPr>
+          <w:lang w:val="nl-BE"/>
+        </w:rPr>
+      </w:pPr>
+      <w:r>
+        <w:rPr>
+          <w:rFonts w:ascii="Consolas" w:hAnsi="Consolas" w:cs="Consolas"/>
+          <w:color w:val="E97132" w:themeColor="accent2"/>
+          <w:sz w:val="18"/>
+          <w:szCs w:val="18"/>
+        </w:rPr>
+        <w:t xml:space="preserve">    </w:t>
+      </w:r>
+      <w:r>
+        <w:rPr>
+          <w:rFonts w:ascii="Consolas" w:hAnsi="Consolas" w:cs="Consolas"/>
+          <w:color w:val="E97132" w:themeColor="accent2"/>
+          <w:sz w:val="18"/>
+          <w:szCs w:val="18"/>
+          <w:lang w:val="nl-BE"/>
+        </w:rPr>
+        <w:t>for (String element : liste) {</w:t>
       </w:r>
     </w:p>
     <w:p>
       <w:pPr>
         <w:shd w:val="clear" w:color="auto" w:fill="EDF5ED"/>
         <w:ind w:left="220"/>
-      </w:pPr>
-      <w:r>
-        <w:rPr>
-          <w:rFonts w:ascii="Consolas" w:hAnsi="Consolas" w:cs="Consolas"/>
-          <w:color w:val="E97132" w:themeColor="accent2"/>
-          <w:sz w:val="18"/>
-          <w:szCs w:val="18"/>
+        <w:rPr>
+          <w:lang w:val="nl-BE"/>
+        </w:rPr>
+      </w:pPr>
+      <w:r>
+        <w:rPr>
+          <w:rFonts w:ascii="Consolas" w:hAnsi="Consolas" w:cs="Consolas"/>
+          <w:color w:val="E97132" w:themeColor="accent2"/>
+          <w:sz w:val="18"/>
+          <w:szCs w:val="18"/>
+          <w:lang w:val="nl-BE"/>
         </w:rPr>
         <w:t xml:space="preserve">        if (!element.isEmpty()) {</w:t>
       </w:r>
@@ -39605,13 +39708,17 @@
       <w:pPr>
         <w:shd w:val="clear" w:color="auto" w:fill="EDF5ED"/>
         <w:ind w:left="220"/>
-      </w:pPr>
-      <w:r>
-        <w:rPr>
-          <w:rFonts w:ascii="Consolas" w:hAnsi="Consolas" w:cs="Consolas"/>
-          <w:color w:val="E97132" w:themeColor="accent2"/>
-          <w:sz w:val="18"/>
-          <w:szCs w:val="18"/>
+        <w:rPr>
+          <w:lang w:val="nl-BE"/>
+        </w:rPr>
+      </w:pPr>
+      <w:r>
+        <w:rPr>
+          <w:rFonts w:ascii="Consolas" w:hAnsi="Consolas" w:cs="Consolas"/>
+          <w:color w:val="E97132" w:themeColor="accent2"/>
+          <w:sz w:val="18"/>
+          <w:szCs w:val="18"/>
+          <w:lang w:val="nl-BE"/>
         </w:rPr>
         <w:lastRenderedPageBreak/>
         <w:t xml:space="preserve">            System.out.println("- " + element);</w:t>
@@ -39628,8 +39735,18 @@
           <w:color w:val="E97132" w:themeColor="accent2"/>
           <w:sz w:val="18"/>
           <w:szCs w:val="18"/>
-        </w:rPr>
-        <w:t xml:space="preserve">        }</w:t>
+          <w:lang w:val="nl-BE"/>
+        </w:rPr>
+        <w:t xml:space="preserve">        </w:t>
+      </w:r>
+      <w:r>
+        <w:rPr>
+          <w:rFonts w:ascii="Consolas" w:hAnsi="Consolas" w:cs="Consolas"/>
+          <w:color w:val="E97132" w:themeColor="accent2"/>
+          <w:sz w:val="18"/>
+          <w:szCs w:val="18"/>
+        </w:rPr>
+        <w:t>}</w:t>
       </w:r>
     </w:p>
     <w:p>
@@ -40191,13 +40308,17 @@
       <w:pPr>
         <w:shd w:val="clear" w:color="auto" w:fill="FBEDED"/>
         <w:ind w:left="220"/>
-      </w:pPr>
-      <w:r>
-        <w:rPr>
-          <w:rFonts w:ascii="Consolas" w:hAnsi="Consolas" w:cs="Consolas"/>
-          <w:color w:val="E97132" w:themeColor="accent2"/>
-          <w:sz w:val="18"/>
-          <w:szCs w:val="18"/>
+        <w:rPr>
+          <w:lang w:val="nl-BE"/>
+        </w:rPr>
+      </w:pPr>
+      <w:r>
+        <w:rPr>
+          <w:rFonts w:ascii="Consolas" w:hAnsi="Consolas" w:cs="Consolas"/>
+          <w:color w:val="E97132" w:themeColor="accent2"/>
+          <w:sz w:val="18"/>
+          <w:szCs w:val="18"/>
+          <w:lang w:val="nl-BE"/>
         </w:rPr>
         <w:t>public void fetchDataFiltered();</w:t>
       </w:r>
@@ -40207,13 +40328,17 @@
         <w:shd w:val="clear" w:color="auto" w:fill="FBEDED"/>
         <w:spacing w:after="140"/>
         <w:ind w:left="220"/>
-      </w:pPr>
-      <w:r>
-        <w:rPr>
-          <w:rFonts w:ascii="Consolas" w:hAnsi="Consolas" w:cs="Consolas"/>
-          <w:color w:val="E97132" w:themeColor="accent2"/>
-          <w:sz w:val="18"/>
-          <w:szCs w:val="18"/>
+        <w:rPr>
+          <w:lang w:val="nl-BE"/>
+        </w:rPr>
+      </w:pPr>
+      <w:r>
+        <w:rPr>
+          <w:rFonts w:ascii="Consolas" w:hAnsi="Consolas" w:cs="Consolas"/>
+          <w:color w:val="E97132" w:themeColor="accent2"/>
+          <w:sz w:val="18"/>
+          <w:szCs w:val="18"/>
+          <w:lang w:val="nl-BE"/>
         </w:rPr>
         <w:t>public void getAllData();</w:t>
       </w:r>
@@ -40223,6 +40348,9 @@
         <w:shd w:val="clear" w:color="auto" w:fill="EDF5ED"/>
         <w:spacing w:before="140"/>
         <w:ind w:left="220"/>
+        <w:rPr>
+          <w:lang w:val="nl-BE"/>
+        </w:rPr>
       </w:pPr>
       <w:r>
         <w:rPr>
@@ -40231,6 +40359,7 @@
           <w:color w:val="2E6B34"/>
           <w:sz w:val="18"/>
           <w:szCs w:val="18"/>
+          <w:lang w:val="nl-BE"/>
         </w:rPr>
         <w:t>PRÉFÉREZ</w:t>
       </w:r>
@@ -40239,13 +40368,17 @@
       <w:pPr>
         <w:shd w:val="clear" w:color="auto" w:fill="EDF5ED"/>
         <w:ind w:left="220"/>
-      </w:pPr>
-      <w:r>
-        <w:rPr>
-          <w:rFonts w:ascii="Consolas" w:hAnsi="Consolas" w:cs="Consolas"/>
-          <w:color w:val="E97132" w:themeColor="accent2"/>
-          <w:sz w:val="18"/>
-          <w:szCs w:val="18"/>
+        <w:rPr>
+          <w:lang w:val="nl-BE"/>
+        </w:rPr>
+      </w:pPr>
+      <w:r>
+        <w:rPr>
+          <w:rFonts w:ascii="Consolas" w:hAnsi="Consolas" w:cs="Consolas"/>
+          <w:color w:val="E97132" w:themeColor="accent2"/>
+          <w:sz w:val="18"/>
+          <w:szCs w:val="18"/>
+          <w:lang w:val="nl-BE"/>
         </w:rPr>
         <w:t>public void getSingleData();</w:t>
       </w:r>
@@ -40254,13 +40387,17 @@
       <w:pPr>
         <w:shd w:val="clear" w:color="auto" w:fill="EDF5ED"/>
         <w:ind w:left="220"/>
-      </w:pPr>
-      <w:r>
-        <w:rPr>
-          <w:rFonts w:ascii="Consolas" w:hAnsi="Consolas" w:cs="Consolas"/>
-          <w:color w:val="E97132" w:themeColor="accent2"/>
-          <w:sz w:val="18"/>
-          <w:szCs w:val="18"/>
+        <w:rPr>
+          <w:lang w:val="nl-BE"/>
+        </w:rPr>
+      </w:pPr>
+      <w:r>
+        <w:rPr>
+          <w:rFonts w:ascii="Consolas" w:hAnsi="Consolas" w:cs="Consolas"/>
+          <w:color w:val="E97132" w:themeColor="accent2"/>
+          <w:sz w:val="18"/>
+          <w:szCs w:val="18"/>
+          <w:lang w:val="nl-BE"/>
         </w:rPr>
         <w:t>public void getFilteredData();</w:t>
       </w:r>
@@ -40270,13 +40407,17 @@
         <w:shd w:val="clear" w:color="auto" w:fill="EDF5ED"/>
         <w:spacing w:after="140"/>
         <w:ind w:left="220"/>
-      </w:pPr>
-      <w:r>
-        <w:rPr>
-          <w:rFonts w:ascii="Consolas" w:hAnsi="Consolas" w:cs="Consolas"/>
-          <w:color w:val="E97132" w:themeColor="accent2"/>
-          <w:sz w:val="18"/>
-          <w:szCs w:val="18"/>
+        <w:rPr>
+          <w:lang w:val="nl-BE"/>
+        </w:rPr>
+      </w:pPr>
+      <w:r>
+        <w:rPr>
+          <w:rFonts w:ascii="Consolas" w:hAnsi="Consolas" w:cs="Consolas"/>
+          <w:color w:val="E97132" w:themeColor="accent2"/>
+          <w:sz w:val="18"/>
+          <w:szCs w:val="18"/>
+          <w:lang w:val="nl-BE"/>
         </w:rPr>
         <w:t>public void getAllData();</w:t>
       </w:r>
@@ -40527,6 +40668,9 @@
         <w:shd w:val="clear" w:color="auto" w:fill="FBEDED"/>
         <w:spacing w:before="140"/>
         <w:ind w:left="220"/>
+        <w:rPr>
+          <w:lang w:val="nl-BE"/>
+        </w:rPr>
       </w:pPr>
       <w:r>
         <w:rPr>
@@ -40535,6 +40679,7 @@
           <w:color w:val="9C2B2B"/>
           <w:sz w:val="18"/>
           <w:szCs w:val="18"/>
+          <w:lang w:val="nl-BE"/>
         </w:rPr>
         <w:t>À ÉVITER</w:t>
       </w:r>
@@ -40543,13 +40688,17 @@
       <w:pPr>
         <w:shd w:val="clear" w:color="auto" w:fill="FBEDED"/>
         <w:ind w:left="220"/>
-      </w:pPr>
-      <w:r>
-        <w:rPr>
-          <w:rFonts w:ascii="Consolas" w:hAnsi="Consolas" w:cs="Consolas"/>
-          <w:color w:val="E97132" w:themeColor="accent2"/>
-          <w:sz w:val="18"/>
-          <w:szCs w:val="18"/>
+        <w:rPr>
+          <w:lang w:val="nl-BE"/>
+        </w:rPr>
+      </w:pPr>
+      <w:r>
+        <w:rPr>
+          <w:rFonts w:ascii="Consolas" w:hAnsi="Consolas" w:cs="Consolas"/>
+          <w:color w:val="E97132" w:themeColor="accent2"/>
+          <w:sz w:val="18"/>
+          <w:szCs w:val="18"/>
+          <w:lang w:val="nl-BE"/>
         </w:rPr>
         <w:t>public void setCustomerAddress(String firstName, String lastName,</w:t>
       </w:r>
@@ -40558,13 +40707,17 @@
       <w:pPr>
         <w:shd w:val="clear" w:color="auto" w:fill="FBEDED"/>
         <w:ind w:left="220"/>
-      </w:pPr>
-      <w:r>
-        <w:rPr>
-          <w:rFonts w:ascii="Consolas" w:hAnsi="Consolas" w:cs="Consolas"/>
-          <w:color w:val="E97132" w:themeColor="accent2"/>
-          <w:sz w:val="18"/>
-          <w:szCs w:val="18"/>
+        <w:rPr>
+          <w:lang w:val="nl-BE"/>
+        </w:rPr>
+      </w:pPr>
+      <w:r>
+        <w:rPr>
+          <w:rFonts w:ascii="Consolas" w:hAnsi="Consolas" w:cs="Consolas"/>
+          <w:color w:val="E97132" w:themeColor="accent2"/>
+          <w:sz w:val="18"/>
+          <w:szCs w:val="18"/>
+          <w:lang w:val="nl-BE"/>
         </w:rPr>
         <w:t xml:space="preserve">                               String streetAddress, String city,</w:t>
       </w:r>
@@ -40573,13 +40726,17 @@
       <w:pPr>
         <w:shd w:val="clear" w:color="auto" w:fill="FBEDED"/>
         <w:ind w:left="220"/>
-      </w:pPr>
-      <w:r>
-        <w:rPr>
-          <w:rFonts w:ascii="Consolas" w:hAnsi="Consolas" w:cs="Consolas"/>
-          <w:color w:val="E97132" w:themeColor="accent2"/>
-          <w:sz w:val="18"/>
-          <w:szCs w:val="18"/>
+        <w:rPr>
+          <w:lang w:val="nl-BE"/>
+        </w:rPr>
+      </w:pPr>
+      <w:r>
+        <w:rPr>
+          <w:rFonts w:ascii="Consolas" w:hAnsi="Consolas" w:cs="Consolas"/>
+          <w:color w:val="E97132" w:themeColor="accent2"/>
+          <w:sz w:val="18"/>
+          <w:szCs w:val="18"/>
+          <w:lang w:val="nl-BE"/>
         </w:rPr>
         <w:t xml:space="preserve">                               String zipCode, String state,</w:t>
       </w:r>
@@ -40589,13 +40746,17 @@
         <w:shd w:val="clear" w:color="auto" w:fill="FBEDED"/>
         <w:spacing w:after="140"/>
         <w:ind w:left="220"/>
-      </w:pPr>
-      <w:r>
-        <w:rPr>
-          <w:rFonts w:ascii="Consolas" w:hAnsi="Consolas" w:cs="Consolas"/>
-          <w:color w:val="E97132" w:themeColor="accent2"/>
-          <w:sz w:val="18"/>
-          <w:szCs w:val="18"/>
+        <w:rPr>
+          <w:lang w:val="nl-BE"/>
+        </w:rPr>
+      </w:pPr>
+      <w:r>
+        <w:rPr>
+          <w:rFonts w:ascii="Consolas" w:hAnsi="Consolas" w:cs="Consolas"/>
+          <w:color w:val="E97132" w:themeColor="accent2"/>
+          <w:sz w:val="18"/>
+          <w:szCs w:val="18"/>
+          <w:lang w:val="nl-BE"/>
         </w:rPr>
         <w:t xml:space="preserve">                               String country, String phoneNumber)</w:t>
       </w:r>
@@ -42290,7 +42451,7 @@
         <w:pStyle w:val="Titre2"/>
         <w:spacing w:before="360" w:after="160"/>
       </w:pPr>
-      <w:bookmarkStart w:id="118" w:name="_Toc243655247"/>
+      <w:bookmarkStart w:id="118" w:name="_Toc243730365"/>
       <w:r>
         <w:rPr>
           <w:b/>
@@ -43149,7 +43310,7 @@
         <w:pStyle w:val="Titre2"/>
         <w:spacing w:before="360" w:after="160"/>
       </w:pPr>
-      <w:bookmarkStart w:id="122" w:name="_Toc243655248"/>
+      <w:bookmarkStart w:id="122" w:name="_Toc243730366"/>
       <w:r>
         <w:rPr>
           <w:b/>
@@ -43830,7 +43991,7 @@
         <w:pStyle w:val="Titre2"/>
         <w:spacing w:before="360" w:after="160"/>
       </w:pPr>
-      <w:bookmarkStart w:id="125" w:name="_Toc243655249"/>
+      <w:bookmarkStart w:id="125" w:name="_Toc243730367"/>
       <w:r>
         <w:rPr>
           <w:b/>
@@ -46462,7 +46623,7 @@
         <w:pStyle w:val="Titre2"/>
         <w:spacing w:before="360" w:after="160"/>
       </w:pPr>
-      <w:bookmarkStart w:id="133" w:name="_Toc243655250"/>
+      <w:bookmarkStart w:id="133" w:name="_Toc243730368"/>
       <w:r>
         <w:rPr>
           <w:b/>
@@ -48415,7 +48576,7 @@
         <w:pStyle w:val="Titre2"/>
         <w:spacing w:before="360" w:after="160"/>
       </w:pPr>
-      <w:bookmarkStart w:id="138" w:name="_Toc243655251"/>
+      <w:bookmarkStart w:id="138" w:name="_Toc243730369"/>
       <w:r>
         <w:rPr>
           <w:b/>
@@ -50412,7 +50573,7 @@
         <w:pStyle w:val="Titre2"/>
         <w:spacing w:before="360" w:after="160"/>
       </w:pPr>
-      <w:bookmarkStart w:id="143" w:name="_Toc243655252"/>
+      <w:bookmarkStart w:id="143" w:name="_Toc243730370"/>
       <w:r>
         <w:rPr>
           <w:b/>
@@ -50454,7 +50615,7 @@
         <w:pStyle w:val="Titre2"/>
         <w:spacing w:before="360" w:after="160"/>
       </w:pPr>
-      <w:bookmarkStart w:id="144" w:name="_Toc243655253"/>
+      <w:bookmarkStart w:id="144" w:name="_Toc243730371"/>
       <w:r>
         <w:rPr>
           <w:b/>
@@ -50526,7 +50687,7 @@
         <w:pStyle w:val="Titre1"/>
         <w:spacing w:after="360"/>
       </w:pPr>
-      <w:bookmarkStart w:id="145" w:name="_Toc243655254"/>
+      <w:bookmarkStart w:id="145" w:name="_Toc243730372"/>
       <w:r>
         <w:rPr>
           <w:b/>
@@ -52117,7 +52278,7 @@
           <w:lang w:val="fr-FR"/>
         </w:rPr>
         <w:tab/>
-        <w:t>5, 8</w:t>
+        <w:t>5, 9</w:t>
       </w:r>
     </w:p>
     <w:p>
@@ -52271,7 +52432,7 @@
           <w:lang w:val="fr-FR"/>
         </w:rPr>
         <w:tab/>
-        <w:t>8</w:t>
+        <w:t>9</w:t>
       </w:r>
     </w:p>
     <w:p>
@@ -54843,7 +55004,7 @@
         <w:noProof/>
       </w:rPr>
       <w:drawing>
-        <wp:inline distT="0" distB="0" distL="0" distR="0" wp14:anchorId="5E4CAC49" wp14:editId="3E7A5EC9">
+        <wp:inline distT="0" distB="0" distL="0" distR="0" wp14:anchorId="397F2CC4">
           <wp:extent cx="1514475" cy="723900"/>
           <wp:effectExtent l="0" t="0" r="0" b="0"/>
           <wp:docPr id="1" name="logo" descr="Logo de l'EPHEC" title="EPHEC"/>
@@ -54922,10 +55083,96 @@
 <file path=word/numbering.xml><?xml version="1.0" encoding="utf-8"?>
 <w:numbering xmlns:wpc="http://schemas.microsoft.com/office/word/2010/wordprocessingCanvas" xmlns:cx="http://schemas.microsoft.com/office/drawing/2014/chartex" xmlns:cx1="http://schemas.microsoft.com/office/drawing/2015/9/8/chartex" xmlns:cx2="http://schemas.microsoft.com/office/drawing/2015/10/21/chartex" xmlns:cx3="http://schemas.microsoft.com/office/drawing/2016/5/9/chartex" xmlns:cx4="http://schemas.microsoft.com/office/drawing/2016/5/10/chartex" xmlns:cx5="http://schemas.microsoft.com/office/drawing/2016/5/11/chartex" xmlns:cx6="http://schemas.microsoft.com/office/drawing/2016/5/12/chartex" xmlns:cx7="http://schemas.microsoft.com/office/drawing/2016/5/13/chartex" xmlns:cx8="http://schemas.microsoft.com/office/drawing/2016/5/14/chartex" xmlns:mc="http://schemas.openxmlformats.org/markup-compatibility/2006" xmlns:m="http://schemas.openxmlformats.org/officeDocument/2006/math" xmlns:aink="http://schemas.microsoft.com/office/drawing/2016/ink" xmlns:am3d="http://schemas.microsoft.com/office/drawing/2017/model3d" xmlns:oel="http://schemas.microsoft.com/office/2019/extlst" xmlns:r="http://schemas.openxmlformats.org/officeDocument/2006/relationships" xmlns:wp14="http://schemas.microsoft.com/office/word/2010/wordprocessingDrawing" xmlns:wp="http://schemas.openxmlformats.org/drawingml/2006/wordprocessingDrawing" xmlns:wpg="http://schemas.microsoft.com/office/word/2010/wordprocessingGroup" xmlns:wpi="http://schemas.microsoft.com/office/word/2010/wordprocessingInk" xmlns:wps="http://schemas.microsoft.com/office/word/2010/wordprocessingShape" xmlns:o="urn:schemas-microsoft-com:office:office" xmlns:v="urn:schemas-microsoft-com:vml" xmlns:w10="urn:schemas-microsoft-com:office:word" xmlns:w="http://schemas.openxmlformats.org/wordprocessingml/2006/main" xmlns:w14="http://schemas.microsoft.com/office/word/2010/wordml" xmlns:w15="http://schemas.microsoft.com/office/word/2012/wordml" xmlns:w16cex="http://schemas.microsoft.com/office/word/2018/wordml/cex" xmlns:w16cid="http://schemas.microsoft.com/office/word/2016/wordml/cid" xmlns:w16="http://schemas.microsoft.com/office/word/2018/wordml" xmlns:w16sdtdh="http://schemas.microsoft.com/office/word/2020/wordml/sdtdatahash" xmlns:w16sdtfl="http://schemas.microsoft.com/office/word/2024/wordml/sdtformatlock" xmlns:w16se="http://schemas.microsoft.com/office/word/2015/wordml/symex" xmlns:w16du="http://schemas.microsoft.com/office/word/2023/wordml/word16du" xmlns:wne="http://schemas.microsoft.com/office/word/2006/wordml" mc:Ignorable="w14 w15 w16se w16cid w16 w16cex w16sdtdh w16sdtfl w16du wp14">
   <w:abstractNum w:abstractNumId="0" w15:restartNumberingAfterBreak="0">
-    <w:nsid w:val="10263846"/>
+    <w:nsid w:val="16D34B62"/>
     <w:multiLevelType w:val="hybridMultilevel"/>
-    <w:tmpl w:val="127ED0DA"/>
-    <w:lvl w:ilvl="0" w:tplc="F73693FE">
+    <w:tmpl w:val="8C808940"/>
+    <w:lvl w:ilvl="0" w:tplc="FAECE0F6">
+      <w:start w:val="1"/>
+      <w:numFmt w:val="bullet"/>
+      <w:lvlText w:val="●"/>
+      <w:lvlJc w:val="left"/>
+      <w:pPr>
+        <w:ind w:left="720" w:hanging="360"/>
+      </w:pPr>
+    </w:lvl>
+    <w:lvl w:ilvl="1" w:tplc="B82E6656">
+      <w:start w:val="1"/>
+      <w:numFmt w:val="bullet"/>
+      <w:lvlText w:val="○"/>
+      <w:lvlJc w:val="left"/>
+      <w:pPr>
+        <w:ind w:left="1440" w:hanging="360"/>
+      </w:pPr>
+    </w:lvl>
+    <w:lvl w:ilvl="2" w:tplc="7E74B36E">
+      <w:start w:val="1"/>
+      <w:numFmt w:val="bullet"/>
+      <w:lvlText w:val="■"/>
+      <w:lvlJc w:val="left"/>
+      <w:pPr>
+        <w:ind w:left="2160" w:hanging="360"/>
+      </w:pPr>
+    </w:lvl>
+    <w:lvl w:ilvl="3" w:tplc="16F064AE">
+      <w:start w:val="1"/>
+      <w:numFmt w:val="bullet"/>
+      <w:lvlText w:val="●"/>
+      <w:lvlJc w:val="left"/>
+      <w:pPr>
+        <w:ind w:left="2880" w:hanging="360"/>
+      </w:pPr>
+    </w:lvl>
+    <w:lvl w:ilvl="4" w:tplc="E15C1650">
+      <w:start w:val="1"/>
+      <w:numFmt w:val="bullet"/>
+      <w:lvlText w:val="○"/>
+      <w:lvlJc w:val="left"/>
+      <w:pPr>
+        <w:ind w:left="3600" w:hanging="360"/>
+      </w:pPr>
+    </w:lvl>
+    <w:lvl w:ilvl="5" w:tplc="819E088C">
+      <w:start w:val="1"/>
+      <w:numFmt w:val="bullet"/>
+      <w:lvlText w:val="■"/>
+      <w:lvlJc w:val="left"/>
+      <w:pPr>
+        <w:ind w:left="4320" w:hanging="360"/>
+      </w:pPr>
+    </w:lvl>
+    <w:lvl w:ilvl="6" w:tplc="27B80932">
+      <w:start w:val="1"/>
+      <w:numFmt w:val="bullet"/>
+      <w:lvlText w:val="●"/>
+      <w:lvlJc w:val="left"/>
+      <w:pPr>
+        <w:ind w:left="5040" w:hanging="360"/>
+      </w:pPr>
+    </w:lvl>
+    <w:lvl w:ilvl="7" w:tplc="446A203C">
+      <w:start w:val="1"/>
+      <w:numFmt w:val="bullet"/>
+      <w:lvlText w:val="●"/>
+      <w:lvlJc w:val="left"/>
+      <w:pPr>
+        <w:ind w:left="5760" w:hanging="360"/>
+      </w:pPr>
+    </w:lvl>
+    <w:lvl w:ilvl="8" w:tplc="F140CF3C">
+      <w:start w:val="1"/>
+      <w:numFmt w:val="bullet"/>
+      <w:lvlText w:val="●"/>
+      <w:lvlJc w:val="left"/>
+      <w:pPr>
+        <w:ind w:left="6480" w:hanging="360"/>
+      </w:pPr>
+    </w:lvl>
+  </w:abstractNum>
+  <w:abstractNum w:abstractNumId="1" w15:restartNumberingAfterBreak="0">
+    <w:nsid w:val="29A25B7E"/>
+    <w:multiLevelType w:val="hybridMultilevel"/>
+    <w:tmpl w:val="6FF225A4"/>
+    <w:lvl w:ilvl="0" w:tplc="51520C8C">
       <w:start w:val="1"/>
       <w:numFmt w:val="bullet"/>
       <w:lvlText w:val="•"/>
@@ -54934,192 +55181,52 @@
         <w:ind w:left="431" w:hanging="259"/>
       </w:pPr>
     </w:lvl>
-    <w:lvl w:ilvl="1" w:tplc="F5CC1902">
+    <w:lvl w:ilvl="1" w:tplc="BA5040A4">
       <w:numFmt w:val="decimal"/>
       <w:lvlText w:val=""/>
       <w:lvlJc w:val="left"/>
     </w:lvl>
-    <w:lvl w:ilvl="2" w:tplc="B2002000">
+    <w:lvl w:ilvl="2" w:tplc="479ECA62">
       <w:numFmt w:val="decimal"/>
       <w:lvlText w:val=""/>
       <w:lvlJc w:val="left"/>
     </w:lvl>
-    <w:lvl w:ilvl="3" w:tplc="F044E240">
+    <w:lvl w:ilvl="3" w:tplc="B49C613C">
       <w:numFmt w:val="decimal"/>
       <w:lvlText w:val=""/>
       <w:lvlJc w:val="left"/>
     </w:lvl>
-    <w:lvl w:ilvl="4" w:tplc="5ED20376">
+    <w:lvl w:ilvl="4" w:tplc="AEE6203A">
       <w:numFmt w:val="decimal"/>
       <w:lvlText w:val=""/>
       <w:lvlJc w:val="left"/>
     </w:lvl>
-    <w:lvl w:ilvl="5" w:tplc="196A805A">
+    <w:lvl w:ilvl="5" w:tplc="A40CE8A8">
       <w:numFmt w:val="decimal"/>
       <w:lvlText w:val=""/>
       <w:lvlJc w:val="left"/>
     </w:lvl>
-    <w:lvl w:ilvl="6" w:tplc="9A5EA64C">
+    <w:lvl w:ilvl="6" w:tplc="39D4E648">
       <w:numFmt w:val="decimal"/>
       <w:lvlText w:val=""/>
       <w:lvlJc w:val="left"/>
     </w:lvl>
-    <w:lvl w:ilvl="7" w:tplc="65BC7AC0">
+    <w:lvl w:ilvl="7" w:tplc="EB7465C6">
       <w:numFmt w:val="decimal"/>
       <w:lvlText w:val=""/>
       <w:lvlJc w:val="left"/>
     </w:lvl>
-    <w:lvl w:ilvl="8" w:tplc="87F430C6">
-      <w:numFmt w:val="decimal"/>
-      <w:lvlText w:val=""/>
-      <w:lvlJc w:val="left"/>
-    </w:lvl>
-  </w:abstractNum>
-  <w:abstractNum w:abstractNumId="1" w15:restartNumberingAfterBreak="0">
-    <w:nsid w:val="624C3A2B"/>
-    <w:multiLevelType w:val="hybridMultilevel"/>
-    <w:tmpl w:val="8208DAFE"/>
-    <w:lvl w:ilvl="0" w:tplc="DA625EB6">
-      <w:start w:val="1"/>
-      <w:numFmt w:val="bullet"/>
-      <w:lvlText w:val="•"/>
-      <w:lvlJc w:val="left"/>
-      <w:pPr>
-        <w:ind w:left="431" w:hanging="259"/>
-      </w:pPr>
-    </w:lvl>
-    <w:lvl w:ilvl="1" w:tplc="F12CA8FE">
-      <w:numFmt w:val="decimal"/>
-      <w:lvlText w:val=""/>
-      <w:lvlJc w:val="left"/>
-    </w:lvl>
-    <w:lvl w:ilvl="2" w:tplc="AA8E7C34">
-      <w:numFmt w:val="decimal"/>
-      <w:lvlText w:val=""/>
-      <w:lvlJc w:val="left"/>
-    </w:lvl>
-    <w:lvl w:ilvl="3" w:tplc="6B90D3A8">
-      <w:numFmt w:val="decimal"/>
-      <w:lvlText w:val=""/>
-      <w:lvlJc w:val="left"/>
-    </w:lvl>
-    <w:lvl w:ilvl="4" w:tplc="6932441A">
-      <w:numFmt w:val="decimal"/>
-      <w:lvlText w:val=""/>
-      <w:lvlJc w:val="left"/>
-    </w:lvl>
-    <w:lvl w:ilvl="5" w:tplc="0CCE8D9E">
-      <w:numFmt w:val="decimal"/>
-      <w:lvlText w:val=""/>
-      <w:lvlJc w:val="left"/>
-    </w:lvl>
-    <w:lvl w:ilvl="6" w:tplc="514EAD46">
-      <w:numFmt w:val="decimal"/>
-      <w:lvlText w:val=""/>
-      <w:lvlJc w:val="left"/>
-    </w:lvl>
-    <w:lvl w:ilvl="7" w:tplc="067AC17A">
-      <w:numFmt w:val="decimal"/>
-      <w:lvlText w:val=""/>
-      <w:lvlJc w:val="left"/>
-    </w:lvl>
-    <w:lvl w:ilvl="8" w:tplc="DAF69244">
+    <w:lvl w:ilvl="8" w:tplc="C14E5EC2">
       <w:numFmt w:val="decimal"/>
       <w:lvlText w:val=""/>
       <w:lvlJc w:val="left"/>
     </w:lvl>
   </w:abstractNum>
   <w:abstractNum w:abstractNumId="2" w15:restartNumberingAfterBreak="0">
-    <w:nsid w:val="6ABA348F"/>
+    <w:nsid w:val="34C527B2"/>
     <w:multiLevelType w:val="hybridMultilevel"/>
-    <w:tmpl w:val="3552F888"/>
-    <w:lvl w:ilvl="0" w:tplc="287A47DA">
-      <w:start w:val="1"/>
-      <w:numFmt w:val="bullet"/>
-      <w:lvlText w:val="●"/>
-      <w:lvlJc w:val="left"/>
-      <w:pPr>
-        <w:ind w:left="720" w:hanging="360"/>
-      </w:pPr>
-    </w:lvl>
-    <w:lvl w:ilvl="1" w:tplc="F5844C26">
-      <w:start w:val="1"/>
-      <w:numFmt w:val="bullet"/>
-      <w:lvlText w:val="○"/>
-      <w:lvlJc w:val="left"/>
-      <w:pPr>
-        <w:ind w:left="1440" w:hanging="360"/>
-      </w:pPr>
-    </w:lvl>
-    <w:lvl w:ilvl="2" w:tplc="BB8ECBC4">
-      <w:start w:val="1"/>
-      <w:numFmt w:val="bullet"/>
-      <w:lvlText w:val="■"/>
-      <w:lvlJc w:val="left"/>
-      <w:pPr>
-        <w:ind w:left="2160" w:hanging="360"/>
-      </w:pPr>
-    </w:lvl>
-    <w:lvl w:ilvl="3" w:tplc="D76E3A64">
-      <w:start w:val="1"/>
-      <w:numFmt w:val="bullet"/>
-      <w:lvlText w:val="●"/>
-      <w:lvlJc w:val="left"/>
-      <w:pPr>
-        <w:ind w:left="2880" w:hanging="360"/>
-      </w:pPr>
-    </w:lvl>
-    <w:lvl w:ilvl="4" w:tplc="5B4CC702">
-      <w:start w:val="1"/>
-      <w:numFmt w:val="bullet"/>
-      <w:lvlText w:val="○"/>
-      <w:lvlJc w:val="left"/>
-      <w:pPr>
-        <w:ind w:left="3600" w:hanging="360"/>
-      </w:pPr>
-    </w:lvl>
-    <w:lvl w:ilvl="5" w:tplc="162CDB78">
-      <w:start w:val="1"/>
-      <w:numFmt w:val="bullet"/>
-      <w:lvlText w:val="■"/>
-      <w:lvlJc w:val="left"/>
-      <w:pPr>
-        <w:ind w:left="4320" w:hanging="360"/>
-      </w:pPr>
-    </w:lvl>
-    <w:lvl w:ilvl="6" w:tplc="247026AE">
-      <w:start w:val="1"/>
-      <w:numFmt w:val="bullet"/>
-      <w:lvlText w:val="●"/>
-      <w:lvlJc w:val="left"/>
-      <w:pPr>
-        <w:ind w:left="5040" w:hanging="360"/>
-      </w:pPr>
-    </w:lvl>
-    <w:lvl w:ilvl="7" w:tplc="5B16C71C">
-      <w:start w:val="1"/>
-      <w:numFmt w:val="bullet"/>
-      <w:lvlText w:val="●"/>
-      <w:lvlJc w:val="left"/>
-      <w:pPr>
-        <w:ind w:left="5760" w:hanging="360"/>
-      </w:pPr>
-    </w:lvl>
-    <w:lvl w:ilvl="8" w:tplc="010432E0">
-      <w:start w:val="1"/>
-      <w:numFmt w:val="bullet"/>
-      <w:lvlText w:val="●"/>
-      <w:lvlJc w:val="left"/>
-      <w:pPr>
-        <w:ind w:left="6480" w:hanging="360"/>
-      </w:pPr>
-    </w:lvl>
-  </w:abstractNum>
-  <w:abstractNum w:abstractNumId="3" w15:restartNumberingAfterBreak="0">
-    <w:nsid w:val="7D4B74A1"/>
-    <w:multiLevelType w:val="hybridMultilevel"/>
-    <w:tmpl w:val="4A68EB2E"/>
-    <w:lvl w:ilvl="0" w:tplc="F34E77E4">
+    <w:tmpl w:val="34A4F22E"/>
+    <w:lvl w:ilvl="0" w:tplc="6ADE4C8A">
       <w:start w:val="1"/>
       <w:numFmt w:val="bullet"/>
       <w:lvlText w:val="•"/>
@@ -55128,67 +55235,121 @@
         <w:ind w:left="431" w:hanging="259"/>
       </w:pPr>
     </w:lvl>
-    <w:lvl w:ilvl="1" w:tplc="DDE2C826">
+    <w:lvl w:ilvl="1" w:tplc="CE2E522E">
       <w:numFmt w:val="decimal"/>
       <w:lvlText w:val=""/>
       <w:lvlJc w:val="left"/>
     </w:lvl>
-    <w:lvl w:ilvl="2" w:tplc="D176275E">
+    <w:lvl w:ilvl="2" w:tplc="2196F3DC">
       <w:numFmt w:val="decimal"/>
       <w:lvlText w:val=""/>
       <w:lvlJc w:val="left"/>
     </w:lvl>
-    <w:lvl w:ilvl="3" w:tplc="CCC8CDDA">
+    <w:lvl w:ilvl="3" w:tplc="05FCDDD2">
       <w:numFmt w:val="decimal"/>
       <w:lvlText w:val=""/>
       <w:lvlJc w:val="left"/>
     </w:lvl>
-    <w:lvl w:ilvl="4" w:tplc="CAD61D48">
+    <w:lvl w:ilvl="4" w:tplc="67A80746">
       <w:numFmt w:val="decimal"/>
       <w:lvlText w:val=""/>
       <w:lvlJc w:val="left"/>
     </w:lvl>
-    <w:lvl w:ilvl="5" w:tplc="C6E4B23C">
+    <w:lvl w:ilvl="5" w:tplc="773E1468">
       <w:numFmt w:val="decimal"/>
       <w:lvlText w:val=""/>
       <w:lvlJc w:val="left"/>
     </w:lvl>
-    <w:lvl w:ilvl="6" w:tplc="511C237E">
+    <w:lvl w:ilvl="6" w:tplc="5BE031F6">
       <w:numFmt w:val="decimal"/>
       <w:lvlText w:val=""/>
       <w:lvlJc w:val="left"/>
     </w:lvl>
-    <w:lvl w:ilvl="7" w:tplc="101C5386">
+    <w:lvl w:ilvl="7" w:tplc="274E53BC">
       <w:numFmt w:val="decimal"/>
       <w:lvlText w:val=""/>
       <w:lvlJc w:val="left"/>
     </w:lvl>
-    <w:lvl w:ilvl="8" w:tplc="B9CEB130">
+    <w:lvl w:ilvl="8" w:tplc="A7D89662">
       <w:numFmt w:val="decimal"/>
       <w:lvlText w:val=""/>
       <w:lvlJc w:val="left"/>
     </w:lvl>
   </w:abstractNum>
-  <w:num w:numId="1" w16cid:durableId="934938881">
+  <w:abstractNum w:abstractNumId="3" w15:restartNumberingAfterBreak="0">
+    <w:nsid w:val="59C10813"/>
+    <w:multiLevelType w:val="hybridMultilevel"/>
+    <w:tmpl w:val="E2742E50"/>
+    <w:lvl w:ilvl="0" w:tplc="39D05B18">
+      <w:start w:val="1"/>
+      <w:numFmt w:val="bullet"/>
+      <w:lvlText w:val="•"/>
+      <w:lvlJc w:val="left"/>
+      <w:pPr>
+        <w:ind w:left="431" w:hanging="259"/>
+      </w:pPr>
+    </w:lvl>
+    <w:lvl w:ilvl="1" w:tplc="FA7E516E">
+      <w:numFmt w:val="decimal"/>
+      <w:lvlText w:val=""/>
+      <w:lvlJc w:val="left"/>
+    </w:lvl>
+    <w:lvl w:ilvl="2" w:tplc="3C40E714">
+      <w:numFmt w:val="decimal"/>
+      <w:lvlText w:val=""/>
+      <w:lvlJc w:val="left"/>
+    </w:lvl>
+    <w:lvl w:ilvl="3" w:tplc="AA2033D8">
+      <w:numFmt w:val="decimal"/>
+      <w:lvlText w:val=""/>
+      <w:lvlJc w:val="left"/>
+    </w:lvl>
+    <w:lvl w:ilvl="4" w:tplc="4ACAC094">
+      <w:numFmt w:val="decimal"/>
+      <w:lvlText w:val=""/>
+      <w:lvlJc w:val="left"/>
+    </w:lvl>
+    <w:lvl w:ilvl="5" w:tplc="9E107BD6">
+      <w:numFmt w:val="decimal"/>
+      <w:lvlText w:val=""/>
+      <w:lvlJc w:val="left"/>
+    </w:lvl>
+    <w:lvl w:ilvl="6" w:tplc="664285F2">
+      <w:numFmt w:val="decimal"/>
+      <w:lvlText w:val=""/>
+      <w:lvlJc w:val="left"/>
+    </w:lvl>
+    <w:lvl w:ilvl="7" w:tplc="01428EC6">
+      <w:numFmt w:val="decimal"/>
+      <w:lvlText w:val=""/>
+      <w:lvlJc w:val="left"/>
+    </w:lvl>
+    <w:lvl w:ilvl="8" w:tplc="BAB68E40">
+      <w:numFmt w:val="decimal"/>
+      <w:lvlText w:val=""/>
+      <w:lvlJc w:val="left"/>
+    </w:lvl>
+  </w:abstractNum>
+  <w:num w:numId="1" w16cid:durableId="1563831598">
+    <w:abstractNumId w:val="0"/>
+    <w:lvlOverride w:ilvl="0">
+      <w:startOverride w:val="1"/>
+    </w:lvlOverride>
+  </w:num>
+  <w:num w:numId="2" w16cid:durableId="771046151">
     <w:abstractNumId w:val="2"/>
     <w:lvlOverride w:ilvl="0">
       <w:startOverride w:val="1"/>
     </w:lvlOverride>
   </w:num>
-  <w:num w:numId="2" w16cid:durableId="1369834898">
-    <w:abstractNumId w:val="3"/>
+  <w:num w:numId="3" w16cid:durableId="48962768">
+    <w:abstractNumId w:val="1"/>
     <w:lvlOverride w:ilvl="0">
       <w:startOverride w:val="1"/>
     </w:lvlOverride>
   </w:num>
-  <w:num w:numId="3" w16cid:durableId="1323048922">
-    <w:abstractNumId w:val="0"/>
-    <w:lvlOverride w:ilvl="0">
-      <w:startOverride w:val="1"/>
-    </w:lvlOverride>
-  </w:num>
-  <w:num w:numId="4" w16cid:durableId="88087487">
-    <w:abstractNumId w:val="1"/>
+  <w:num w:numId="4" w16cid:durableId="495920017">
+    <w:abstractNumId w:val="3"/>
     <w:lvlOverride w:ilvl="0">
       <w:startOverride w:val="1"/>
     </w:lvlOverride>
@@ -55849,7 +56010,7 @@
     <w:autoRedefine/>
     <w:uiPriority w:val="39"/>
     <w:unhideWhenUsed/>
-    <w:rsid w:val="00FC2EB1"/>
+    <w:rsid w:val="00CE4045"/>
     <w:pPr>
       <w:spacing w:after="100"/>
     </w:pPr>
@@ -55861,7 +56022,7 @@
     <w:autoRedefine/>
     <w:uiPriority w:val="39"/>
     <w:unhideWhenUsed/>
-    <w:rsid w:val="00FC2EB1"/>
+    <w:rsid w:val="00CE4045"/>
     <w:pPr>
       <w:spacing w:after="100"/>
       <w:ind w:left="220"/>

</xml_diff>